<commit_message>
update doc names inside the project
</commit_message>
<xml_diff>
--- a/1-research/Research.docx
+++ b/1-research/Research.docx
@@ -7,17 +7,19 @@
         <w:spacing w:after="0" w:line="240" w:lineRule="auto"/>
         <w:jc w:val="center"/>
         <w:rPr>
-          <w:lang w:val="pt-BR"/>
-        </w:rPr>
-      </w:pPr>
-      <w:proofErr w:type="spellStart"/>
-      <w:r>
-        <w:rPr>
+          <w:b/>
+          <w:bCs/>
+          <w:lang w:val="pt-BR"/>
+        </w:rPr>
+      </w:pPr>
+      <w:r>
+        <w:rPr>
+          <w:b/>
+          <w:bCs/>
           <w:lang w:val="pt-BR"/>
         </w:rPr>
         <w:t>Research</w:t>
       </w:r>
-      <w:proofErr w:type="spellEnd"/>
     </w:p>
     <w:p>
       <w:pPr>
@@ -31,7 +33,38 @@
     <w:p>
       <w:pPr>
         <w:spacing w:after="0" w:line="240" w:lineRule="auto"/>
-        <w:jc w:val="center"/>
+        <w:rPr>
+          <w:lang w:val="pt-BR"/>
+        </w:rPr>
+      </w:pPr>
+      <w:r>
+        <w:rPr>
+          <w:lang w:val="pt-BR"/>
+        </w:rPr>
+        <w:t>________________</w:t>
+      </w:r>
+    </w:p>
+    <w:p>
+      <w:pPr>
+        <w:spacing w:after="0" w:line="240" w:lineRule="auto"/>
+        <w:rPr>
+          <w:b/>
+          <w:bCs/>
+          <w:lang w:val="pt-BR"/>
+        </w:rPr>
+      </w:pPr>
+      <w:r>
+        <w:rPr>
+          <w:b/>
+          <w:bCs/>
+          <w:lang w:val="pt-BR"/>
+        </w:rPr>
+        <w:t>Estrutura</w:t>
+      </w:r>
+    </w:p>
+    <w:p>
+      <w:pPr>
+        <w:spacing w:after="0" w:line="240" w:lineRule="auto"/>
         <w:rPr>
           <w:lang w:val="pt-BR"/>
         </w:rPr>
@@ -138,21 +171,7 @@
         <w:rPr>
           <w:lang w:val="pt-BR"/>
         </w:rPr>
-        <w:t xml:space="preserve"> instantâneo com os programas federais/provinciais aplicáveis (RTRI, </w:t>
-      </w:r>
-      <w:proofErr w:type="gramStart"/>
-      <w:r>
-        <w:rPr>
-          <w:lang w:val="pt-BR"/>
-        </w:rPr>
-        <w:t>BDC, etc.</w:t>
-      </w:r>
-      <w:proofErr w:type="gramEnd"/>
-      <w:r>
-        <w:rPr>
-          <w:lang w:val="pt-BR"/>
-        </w:rPr>
-        <w:t>).</w:t>
+        <w:t xml:space="preserve"> instantâneo com os programas federais/provinciais aplicáveis (RTRI, BDC, etc.).</w:t>
       </w:r>
     </w:p>
     <w:p>
@@ -598,6 +617,7 @@
           <w:bCs/>
           <w:lang w:val="pt-BR"/>
         </w:rPr>
+        <w:lastRenderedPageBreak/>
         <w:t>Visão de Produto:</w:t>
       </w:r>
       <w:r>
@@ -606,6 +626,2514 @@
         </w:rPr>
         <w:t xml:space="preserve"> Vai além de "escrever código por escrever"; demonstra que você sabe identificar um problema de negócio real e desenhar uma solução técnica escalável.</w:t>
       </w:r>
+    </w:p>
+    <w:p>
+      <w:pPr>
+        <w:spacing w:after="0" w:line="240" w:lineRule="auto"/>
+        <w:rPr>
+          <w:lang w:val="pt-BR"/>
+        </w:rPr>
+      </w:pPr>
+    </w:p>
+    <w:p>
+      <w:pPr>
+        <w:spacing w:after="0" w:line="240" w:lineRule="auto"/>
+        <w:rPr>
+          <w:lang w:val="pt-BR"/>
+        </w:rPr>
+      </w:pPr>
+      <w:r>
+        <w:rPr>
+          <w:lang w:val="pt-BR"/>
+        </w:rPr>
+        <w:t>__________</w:t>
+      </w:r>
+    </w:p>
+    <w:p>
+      <w:pPr>
+        <w:spacing w:after="0" w:line="240" w:lineRule="auto"/>
+        <w:rPr>
+          <w:b/>
+          <w:bCs/>
+          <w:lang w:val="pt-BR"/>
+        </w:rPr>
+      </w:pPr>
+      <w:r>
+        <w:rPr>
+          <w:b/>
+          <w:bCs/>
+          <w:lang w:val="pt-BR"/>
+        </w:rPr>
+        <w:t>Entendendo o mercado</w:t>
+      </w:r>
+    </w:p>
+    <w:p>
+      <w:pPr>
+        <w:spacing w:after="0" w:line="240" w:lineRule="auto"/>
+        <w:rPr>
+          <w:lang w:val="pt-BR"/>
+        </w:rPr>
+      </w:pPr>
+    </w:p>
+    <w:p>
+      <w:pPr>
+        <w:spacing w:after="0" w:line="240" w:lineRule="auto"/>
+        <w:rPr>
+          <w:lang w:val="pt-BR"/>
+        </w:rPr>
+      </w:pPr>
+      <w:r>
+        <w:rPr>
+          <w:lang w:val="pt-BR"/>
+        </w:rPr>
+        <w:t xml:space="preserve">Para o seu projeto fazer sentido real, você precisa entender o cenário onde ele vai atuar. No Canadá, as Pequenas e Médias Empresas (SMEs ou </w:t>
+      </w:r>
+      <w:r>
+        <w:rPr>
+          <w:i/>
+          <w:iCs/>
+          <w:lang w:val="pt-BR"/>
+        </w:rPr>
+        <w:t>PMEs</w:t>
+      </w:r>
+      <w:r>
+        <w:rPr>
+          <w:lang w:val="pt-BR"/>
+        </w:rPr>
+        <w:t>) são a verdadeira espinha dorsal da economia. [</w:t>
+      </w:r>
+      <w:r>
+        <w:fldChar w:fldCharType="begin"/>
+      </w:r>
+      <w:r>
+        <w:rPr>
+          <w:lang w:val="pt-BR"/>
+        </w:rPr>
+        <w:instrText>HYPERLINK "https://www.fraserinstitute.org/commentary/small-business-canada-reality-check"</w:instrText>
+      </w:r>
+      <w:r>
+        <w:fldChar w:fldCharType="separate"/>
+      </w:r>
+      <w:r>
+        <w:rPr>
+          <w:rStyle w:val="Hyperlink"/>
+          <w:lang w:val="pt-BR"/>
+        </w:rPr>
+        <w:t>1</w:t>
+      </w:r>
+      <w:r>
+        <w:rPr>
+          <w:lang w:val="pt-BR"/>
+        </w:rPr>
+        <w:fldChar w:fldCharType="end"/>
+      </w:r>
+      <w:r>
+        <w:rPr>
+          <w:lang w:val="pt-BR"/>
+        </w:rPr>
+        <w:t>]</w:t>
+      </w:r>
+    </w:p>
+    <w:p>
+      <w:pPr>
+        <w:spacing w:after="0" w:line="240" w:lineRule="auto"/>
+        <w:rPr>
+          <w:lang w:val="pt-BR"/>
+        </w:rPr>
+      </w:pPr>
+      <w:r>
+        <w:rPr>
+          <w:lang w:val="pt-BR"/>
+        </w:rPr>
+        <w:t xml:space="preserve">O cenário canadense está dividido em uma enorme estrutura de auxílio, mas que sofre de um problema crônico: </w:t>
+      </w:r>
+      <w:r>
+        <w:rPr>
+          <w:b/>
+          <w:bCs/>
+          <w:lang w:val="pt-BR"/>
+        </w:rPr>
+        <w:t>excesso de informação e burocracia</w:t>
+      </w:r>
+      <w:r>
+        <w:rPr>
+          <w:lang w:val="pt-BR"/>
+        </w:rPr>
+        <w:t>. É exatamente aí que o seu aplicativo entra.</w:t>
+      </w:r>
+    </w:p>
+    <w:p>
+      <w:pPr>
+        <w:spacing w:after="0" w:line="240" w:lineRule="auto"/>
+        <w:rPr>
+          <w:lang w:val="pt-BR"/>
+        </w:rPr>
+      </w:pPr>
+      <w:r>
+        <w:rPr>
+          <w:lang w:val="pt-BR"/>
+        </w:rPr>
+        <w:t>Abaixo, apresento um panorama detalhado da situação atual e o mercado em que você está pisando:</w:t>
+      </w:r>
+    </w:p>
+    <w:p>
+      <w:pPr>
+        <w:spacing w:after="0" w:line="240" w:lineRule="auto"/>
+        <w:rPr>
+          <w:lang w:val="pt-BR"/>
+        </w:rPr>
+      </w:pPr>
+    </w:p>
+    <w:p>
+      <w:pPr>
+        <w:spacing w:after="0" w:line="240" w:lineRule="auto"/>
+        <w:rPr>
+          <w:b/>
+          <w:bCs/>
+          <w:lang w:val="pt-BR"/>
+        </w:rPr>
+      </w:pPr>
+      <w:r>
+        <w:rPr>
+          <w:b/>
+          <w:bCs/>
+          <w:lang w:val="pt-BR"/>
+        </w:rPr>
+        <w:t>1. A Realidade das Empresas no Canadá (O Cenário)</w:t>
+      </w:r>
+    </w:p>
+    <w:p>
+      <w:pPr>
+        <w:numPr>
+          <w:ilvl w:val="0"/>
+          <w:numId w:val="9"/>
+        </w:numPr>
+        <w:spacing w:after="0" w:line="240" w:lineRule="auto"/>
+      </w:pPr>
+      <w:r>
+        <w:rPr>
+          <w:b/>
+          <w:bCs/>
+          <w:lang w:val="pt-BR"/>
+        </w:rPr>
+        <w:t>Elas são a maioria esmagadora:</w:t>
+      </w:r>
+      <w:r>
+        <w:rPr>
+          <w:lang w:val="pt-BR"/>
+        </w:rPr>
+        <w:t xml:space="preserve"> Mais de </w:t>
+      </w:r>
+      <w:r>
+        <w:rPr>
+          <w:b/>
+          <w:bCs/>
+          <w:lang w:val="pt-BR"/>
+        </w:rPr>
+        <w:t>97% de todas as empresas canadenses são pequenas</w:t>
+      </w:r>
+      <w:r>
+        <w:rPr>
+          <w:lang w:val="pt-BR"/>
+        </w:rPr>
+        <w:t xml:space="preserve"> (menos de 100 funcionários). Elas empregam quase metade da força de trabalho privada do país. </w:t>
+      </w:r>
+      <w:r>
+        <w:t>[</w:t>
+      </w:r>
+      <w:hyperlink r:id="rId5" w:history="1">
+        <w:r>
+          <w:rPr>
+            <w:rStyle w:val="Hyperlink"/>
+          </w:rPr>
+          <w:t>1</w:t>
+        </w:r>
+      </w:hyperlink>
+      <w:r>
+        <w:t xml:space="preserve">, </w:t>
+      </w:r>
+      <w:hyperlink r:id="rId6" w:history="1">
+        <w:r>
+          <w:rPr>
+            <w:rStyle w:val="Hyperlink"/>
+          </w:rPr>
+          <w:t>2</w:t>
+        </w:r>
+      </w:hyperlink>
+      <w:r>
+        <w:t>]</w:t>
+      </w:r>
+    </w:p>
+    <w:p>
+      <w:pPr>
+        <w:numPr>
+          <w:ilvl w:val="0"/>
+          <w:numId w:val="9"/>
+        </w:numPr>
+        <w:spacing w:after="0" w:line="240" w:lineRule="auto"/>
+      </w:pPr>
+      <w:r>
+        <w:rPr>
+          <w:b/>
+          <w:bCs/>
+          <w:lang w:val="pt-BR"/>
+        </w:rPr>
+        <w:t>A Grande Dor Atual (2026):</w:t>
+      </w:r>
+      <w:r>
+        <w:rPr>
+          <w:lang w:val="pt-BR"/>
+        </w:rPr>
+        <w:t xml:space="preserve"> O mercado canadense está enfrentando pressões imensas devido a </w:t>
+      </w:r>
+      <w:r>
+        <w:rPr>
+          <w:b/>
+          <w:bCs/>
+          <w:lang w:val="pt-BR"/>
+        </w:rPr>
+        <w:t>mudanças nas políticas comerciais e tarifas com os Estados Unidos</w:t>
+      </w:r>
+      <w:r>
+        <w:rPr>
+          <w:lang w:val="pt-BR"/>
+        </w:rPr>
+        <w:t xml:space="preserve"> (o maior parceiro comercial do país). Setores de manufatura, logística e agricultura estão sofrendo com custos de insumos e quebras na cadeia de suprimentos. Além disso, há uma pressão forte do governo para que as empresas adotem inteligência artificial e migrem para economias de baixo carbono. </w:t>
+      </w:r>
+      <w:r>
+        <w:t>[</w:t>
+      </w:r>
+      <w:hyperlink r:id="rId7" w:history="1">
+        <w:r>
+          <w:rPr>
+            <w:rStyle w:val="Hyperlink"/>
+          </w:rPr>
+          <w:t>1</w:t>
+        </w:r>
+      </w:hyperlink>
+      <w:r>
+        <w:t xml:space="preserve">, </w:t>
+      </w:r>
+      <w:hyperlink r:id="rId8" w:history="1">
+        <w:r>
+          <w:rPr>
+            <w:rStyle w:val="Hyperlink"/>
+          </w:rPr>
+          <w:t>2</w:t>
+        </w:r>
+      </w:hyperlink>
+      <w:r>
+        <w:t xml:space="preserve">, </w:t>
+      </w:r>
+      <w:hyperlink r:id="rId9" w:history="1">
+        <w:r>
+          <w:rPr>
+            <w:rStyle w:val="Hyperlink"/>
+          </w:rPr>
+          <w:t>3</w:t>
+        </w:r>
+      </w:hyperlink>
+      <w:r>
+        <w:t xml:space="preserve">, </w:t>
+      </w:r>
+      <w:hyperlink r:id="rId10" w:history="1">
+        <w:r>
+          <w:rPr>
+            <w:rStyle w:val="Hyperlink"/>
+          </w:rPr>
+          <w:t>4</w:t>
+        </w:r>
+      </w:hyperlink>
+      <w:r>
+        <w:t xml:space="preserve">, </w:t>
+      </w:r>
+      <w:hyperlink r:id="rId11" w:history="1">
+        <w:r>
+          <w:rPr>
+            <w:rStyle w:val="Hyperlink"/>
+          </w:rPr>
+          <w:t>5</w:t>
+        </w:r>
+      </w:hyperlink>
+      <w:r>
+        <w:t>]</w:t>
+      </w:r>
+    </w:p>
+    <w:p>
+      <w:pPr>
+        <w:spacing w:after="0" w:line="240" w:lineRule="auto"/>
+        <w:rPr>
+          <w:lang w:val="pt-BR"/>
+        </w:rPr>
+      </w:pPr>
+    </w:p>
+    <w:p>
+      <w:pPr>
+        <w:spacing w:after="0" w:line="240" w:lineRule="auto"/>
+        <w:rPr>
+          <w:b/>
+          <w:bCs/>
+          <w:lang w:val="pt-BR"/>
+        </w:rPr>
+      </w:pPr>
+      <w:r>
+        <w:rPr>
+          <w:b/>
+          <w:bCs/>
+          <w:lang w:val="pt-BR"/>
+        </w:rPr>
+        <w:t>2. Principais Iniciativas Públicas (Apoio Governamental)</w:t>
+      </w:r>
+    </w:p>
+    <w:p>
+      <w:pPr>
+        <w:spacing w:after="0" w:line="240" w:lineRule="auto"/>
+        <w:rPr>
+          <w:lang w:val="pt-BR"/>
+        </w:rPr>
+      </w:pPr>
+      <w:r>
+        <w:rPr>
+          <w:lang w:val="pt-BR"/>
+        </w:rPr>
+        <w:t xml:space="preserve">O governo do Canadá injeta </w:t>
+      </w:r>
+      <w:r>
+        <w:rPr>
+          <w:b/>
+          <w:bCs/>
+          <w:lang w:val="pt-BR"/>
+        </w:rPr>
+        <w:t>bilhões de dólares</w:t>
+      </w:r>
+      <w:r>
+        <w:rPr>
+          <w:lang w:val="pt-BR"/>
+        </w:rPr>
+        <w:t xml:space="preserve"> anualmente para apoiar empresas, mas divide isso em três esferas (Federal, Provincial e Regional). Essa divisão é o principal motivo pelo qual os empreendedores ficam confusos. [</w:t>
+      </w:r>
+      <w:hyperlink r:id="rId12" w:history="1">
+        <w:r>
+          <w:rPr>
+            <w:rStyle w:val="Hyperlink"/>
+            <w:lang w:val="pt-BR"/>
+          </w:rPr>
+          <w:t>1</w:t>
+        </w:r>
+      </w:hyperlink>
+      <w:r>
+        <w:rPr>
+          <w:lang w:val="pt-BR"/>
+        </w:rPr>
+        <w:t xml:space="preserve">, </w:t>
+      </w:r>
+      <w:hyperlink r:id="rId13" w:history="1">
+        <w:r>
+          <w:rPr>
+            <w:rStyle w:val="Hyperlink"/>
+            <w:lang w:val="pt-BR"/>
+          </w:rPr>
+          <w:t>2</w:t>
+        </w:r>
+      </w:hyperlink>
+      <w:r>
+        <w:rPr>
+          <w:lang w:val="pt-BR"/>
+        </w:rPr>
+        <w:t xml:space="preserve">, </w:t>
+      </w:r>
+      <w:hyperlink r:id="rId14" w:history="1">
+        <w:r>
+          <w:rPr>
+            <w:rStyle w:val="Hyperlink"/>
+            <w:lang w:val="pt-BR"/>
+          </w:rPr>
+          <w:t>3</w:t>
+        </w:r>
+      </w:hyperlink>
+      <w:r>
+        <w:rPr>
+          <w:lang w:val="pt-BR"/>
+        </w:rPr>
+        <w:t>]</w:t>
+      </w:r>
+    </w:p>
+    <w:p>
+      <w:pPr>
+        <w:spacing w:after="0" w:line="240" w:lineRule="auto"/>
+        <w:rPr>
+          <w:lang w:val="pt-BR"/>
+        </w:rPr>
+      </w:pPr>
+      <w:r>
+        <w:rPr>
+          <w:lang w:val="pt-BR"/>
+        </w:rPr>
+        <w:t>Os tipos de produtos ou ajudas públicas oferecidos dividem-se em:</w:t>
+      </w:r>
+    </w:p>
+    <w:p>
+      <w:pPr>
+        <w:numPr>
+          <w:ilvl w:val="0"/>
+          <w:numId w:val="10"/>
+        </w:numPr>
+        <w:spacing w:after="0" w:line="240" w:lineRule="auto"/>
+        <w:rPr>
+          <w:lang w:val="pt-BR"/>
+        </w:rPr>
+      </w:pPr>
+      <w:r>
+        <w:rPr>
+          <w:b/>
+          <w:bCs/>
+          <w:lang w:val="pt-BR"/>
+        </w:rPr>
+        <w:t>Grants (Subsídios Não-Reembolsáveis):</w:t>
+      </w:r>
+      <w:r>
+        <w:rPr>
+          <w:lang w:val="pt-BR"/>
+        </w:rPr>
+        <w:t xml:space="preserve"> Dinheiro que o governo dá e a empresa </w:t>
+      </w:r>
+      <w:r>
+        <w:rPr>
+          <w:b/>
+          <w:bCs/>
+          <w:lang w:val="pt-BR"/>
+        </w:rPr>
+        <w:t>não precisa pagar de volta</w:t>
+      </w:r>
+      <w:r>
+        <w:rPr>
+          <w:lang w:val="pt-BR"/>
+        </w:rPr>
+        <w:t>.</w:t>
+      </w:r>
+    </w:p>
+    <w:p>
+      <w:pPr>
+        <w:numPr>
+          <w:ilvl w:val="1"/>
+          <w:numId w:val="10"/>
+        </w:numPr>
+        <w:spacing w:after="0" w:line="240" w:lineRule="auto"/>
+        <w:rPr>
+          <w:lang w:val="pt-BR"/>
+        </w:rPr>
+      </w:pPr>
+      <w:r>
+        <w:rPr>
+          <w:i/>
+          <w:iCs/>
+          <w:lang w:val="pt-BR"/>
+        </w:rPr>
+        <w:t>Exemplo:</w:t>
+      </w:r>
+      <w:r>
+        <w:rPr>
+          <w:lang w:val="pt-BR"/>
+        </w:rPr>
+        <w:t xml:space="preserve"> O </w:t>
+      </w:r>
+      <w:r>
+        <w:rPr>
+          <w:b/>
+          <w:bCs/>
+          <w:lang w:val="pt-BR"/>
+        </w:rPr>
+        <w:t>Regional Tariff Response Initiative (RTRI)</w:t>
+      </w:r>
+      <w:r>
+        <w:rPr>
+          <w:lang w:val="pt-BR"/>
+        </w:rPr>
+        <w:t>, uma resposta direta do governo federal (injetando $500 milhões através de agências de desenvolvimento regional) para dar até $2 milhões a fundo perdido para empresas afetadas por tarifas comerciais sobreviverem e reestruturarem suas cadeias de suprimentos.</w:t>
+      </w:r>
+    </w:p>
+    <w:p>
+      <w:pPr>
+        <w:numPr>
+          <w:ilvl w:val="1"/>
+          <w:numId w:val="10"/>
+        </w:numPr>
+        <w:spacing w:after="0" w:line="240" w:lineRule="auto"/>
+      </w:pPr>
+      <w:r>
+        <w:rPr>
+          <w:i/>
+          <w:iCs/>
+          <w:lang w:val="pt-BR"/>
+        </w:rPr>
+        <w:t>Exemplo:</w:t>
+      </w:r>
+      <w:r>
+        <w:rPr>
+          <w:lang w:val="pt-BR"/>
+        </w:rPr>
+        <w:t xml:space="preserve"> O </w:t>
+      </w:r>
+      <w:r>
+        <w:rPr>
+          <w:b/>
+          <w:bCs/>
+          <w:lang w:val="pt-BR"/>
+        </w:rPr>
+        <w:t>IRAP (Industrial Research Assistance Program)</w:t>
+      </w:r>
+      <w:r>
+        <w:rPr>
+          <w:lang w:val="pt-BR"/>
+        </w:rPr>
+        <w:t xml:space="preserve">, que financia inovação tecnológica e desenvolvimento de software. </w:t>
+      </w:r>
+      <w:r>
+        <w:t>[</w:t>
+      </w:r>
+      <w:hyperlink r:id="rId15" w:history="1">
+        <w:r>
+          <w:rPr>
+            <w:rStyle w:val="Hyperlink"/>
+          </w:rPr>
+          <w:t>1</w:t>
+        </w:r>
+      </w:hyperlink>
+      <w:r>
+        <w:t xml:space="preserve">, </w:t>
+      </w:r>
+      <w:hyperlink r:id="rId16" w:history="1">
+        <w:r>
+          <w:rPr>
+            <w:rStyle w:val="Hyperlink"/>
+          </w:rPr>
+          <w:t>2</w:t>
+        </w:r>
+      </w:hyperlink>
+      <w:r>
+        <w:t xml:space="preserve">, </w:t>
+      </w:r>
+      <w:hyperlink r:id="rId17" w:history="1">
+        <w:r>
+          <w:rPr>
+            <w:rStyle w:val="Hyperlink"/>
+          </w:rPr>
+          <w:t>3</w:t>
+        </w:r>
+      </w:hyperlink>
+      <w:r>
+        <w:t xml:space="preserve">, </w:t>
+      </w:r>
+      <w:hyperlink r:id="rId18" w:history="1">
+        <w:r>
+          <w:rPr>
+            <w:rStyle w:val="Hyperlink"/>
+          </w:rPr>
+          <w:t>4</w:t>
+        </w:r>
+      </w:hyperlink>
+      <w:r>
+        <w:t>]</w:t>
+      </w:r>
+    </w:p>
+    <w:p>
+      <w:pPr>
+        <w:numPr>
+          <w:ilvl w:val="0"/>
+          <w:numId w:val="10"/>
+        </w:numPr>
+        <w:spacing w:after="0" w:line="240" w:lineRule="auto"/>
+        <w:rPr>
+          <w:lang w:val="pt-BR"/>
+        </w:rPr>
+      </w:pPr>
+      <w:r>
+        <w:rPr>
+          <w:b/>
+          <w:bCs/>
+          <w:lang w:val="pt-BR"/>
+        </w:rPr>
+        <w:t>Government-Backed Loans (Empréstimos com Garantia Pública):</w:t>
+      </w:r>
+      <w:r>
+        <w:rPr>
+          <w:lang w:val="pt-BR"/>
+        </w:rPr>
+        <w:t xml:space="preserve"> O governo não te empresta o dinheiro diretamente, mas ele atua como seu "fiador" junto aos bancos tradicionais (como RBC, TD, Scotiabank).</w:t>
+      </w:r>
+    </w:p>
+    <w:p>
+      <w:pPr>
+        <w:spacing w:after="0" w:line="240" w:lineRule="auto"/>
+        <w:rPr>
+          <w:lang w:val="pt-BR"/>
+        </w:rPr>
+      </w:pPr>
+    </w:p>
+    <w:p>
+      <w:pPr>
+        <w:numPr>
+          <w:ilvl w:val="0"/>
+          <w:numId w:val="11"/>
+        </w:numPr>
+        <w:spacing w:after="0" w:line="240" w:lineRule="auto"/>
+      </w:pPr>
+      <w:r>
+        <w:t xml:space="preserve">  </w:t>
+      </w:r>
+      <w:r>
+        <w:rPr>
+          <w:i/>
+          <w:iCs/>
+        </w:rPr>
+        <w:t>Exemplo:</w:t>
+      </w:r>
+      <w:r>
+        <w:t xml:space="preserve"> O </w:t>
+      </w:r>
+      <w:r>
+        <w:rPr>
+          <w:b/>
+          <w:bCs/>
+        </w:rPr>
+        <w:t>Canada Small Business Financing Program (CSBFP)</w:t>
+      </w:r>
+      <w:r>
+        <w:t xml:space="preserve">. </w:t>
+      </w:r>
+      <w:r>
+        <w:rPr>
+          <w:lang w:val="pt-BR"/>
+        </w:rPr>
+        <w:t xml:space="preserve">Se o banco aprovar o empréstimo, o governo garante 85% do valor se a empresa falir. Isso faz os bancos emprestarem dinheiro muito mais facilmente para quem está começando. </w:t>
+      </w:r>
+      <w:r>
+        <w:t>[</w:t>
+      </w:r>
+      <w:hyperlink r:id="rId19" w:history="1">
+        <w:r>
+          <w:rPr>
+            <w:rStyle w:val="Hyperlink"/>
+          </w:rPr>
+          <w:t>1</w:t>
+        </w:r>
+      </w:hyperlink>
+      <w:r>
+        <w:t xml:space="preserve">, </w:t>
+      </w:r>
+      <w:hyperlink r:id="rId20" w:history="1">
+        <w:r>
+          <w:rPr>
+            <w:rStyle w:val="Hyperlink"/>
+          </w:rPr>
+          <w:t>2</w:t>
+        </w:r>
+      </w:hyperlink>
+      <w:r>
+        <w:t>]</w:t>
+      </w:r>
+    </w:p>
+    <w:p>
+      <w:pPr>
+        <w:spacing w:after="0" w:line="240" w:lineRule="auto"/>
+        <w:rPr>
+          <w:lang w:val="pt-BR"/>
+        </w:rPr>
+      </w:pPr>
+      <w:r>
+        <w:t></w:t>
+      </w:r>
+      <w:r>
+        <w:rPr>
+          <w:lang w:val="pt-BR"/>
+        </w:rPr>
+        <w:tab/>
+      </w:r>
+      <w:r>
+        <w:rPr>
+          <w:lang w:val="pt-BR"/>
+        </w:rPr>
+        <w:t xml:space="preserve"> </w:t>
+      </w:r>
+      <w:r>
+        <w:rPr>
+          <w:b/>
+          <w:bCs/>
+          <w:lang w:val="pt-BR"/>
+        </w:rPr>
+        <w:t>Tax Credits (Créditos de Imposto):</w:t>
+      </w:r>
+      <w:r>
+        <w:rPr>
+          <w:lang w:val="pt-BR"/>
+        </w:rPr>
+        <w:t xml:space="preserve"> O governo devolve em dinheiro parte do que a empresa gastou com pesquisa.</w:t>
+      </w:r>
+    </w:p>
+    <w:p>
+      <w:pPr>
+        <w:numPr>
+          <w:ilvl w:val="0"/>
+          <w:numId w:val="12"/>
+        </w:numPr>
+        <w:spacing w:after="0" w:line="240" w:lineRule="auto"/>
+        <w:rPr>
+          <w:lang w:val="pt-BR"/>
+        </w:rPr>
+      </w:pPr>
+      <w:r>
+        <w:rPr>
+          <w:i/>
+          <w:iCs/>
+          <w:lang w:val="pt-BR"/>
+        </w:rPr>
+        <w:lastRenderedPageBreak/>
+        <w:t>Exemplo:</w:t>
+      </w:r>
+      <w:r>
+        <w:rPr>
+          <w:lang w:val="pt-BR"/>
+        </w:rPr>
+        <w:t xml:space="preserve"> O </w:t>
+      </w:r>
+      <w:r>
+        <w:rPr>
+          <w:b/>
+          <w:bCs/>
+          <w:lang w:val="pt-BR"/>
+        </w:rPr>
+        <w:t>SR&amp;ED</w:t>
+      </w:r>
+      <w:r>
+        <w:rPr>
+          <w:lang w:val="pt-BR"/>
+        </w:rPr>
+        <w:t>, o maior programa de incentivo do país. Se uma SME gasta dinheiro desenvolvendo um software ou produto novo, o governo reembolsa até 35% do custo em formato de cheque, mesmo que a empresa dê prejuízo no ano.</w:t>
+      </w:r>
+    </w:p>
+    <w:p>
+      <w:pPr>
+        <w:spacing w:after="0" w:line="240" w:lineRule="auto"/>
+        <w:rPr>
+          <w:lang w:val="pt-BR"/>
+        </w:rPr>
+      </w:pPr>
+    </w:p>
+    <w:p>
+      <w:pPr>
+        <w:spacing w:after="0" w:line="240" w:lineRule="auto"/>
+        <w:rPr>
+          <w:lang w:val="pt-BR"/>
+        </w:rPr>
+      </w:pPr>
+    </w:p>
+    <w:p>
+      <w:pPr>
+        <w:spacing w:after="0" w:line="240" w:lineRule="auto"/>
+        <w:rPr>
+          <w:b/>
+          <w:bCs/>
+          <w:lang w:val="pt-BR"/>
+        </w:rPr>
+      </w:pPr>
+      <w:r>
+        <w:rPr>
+          <w:b/>
+          <w:bCs/>
+          <w:lang w:val="pt-BR"/>
+        </w:rPr>
+        <w:t>3. Principais Iniciativas Privadas e Terceiro Setor</w:t>
+      </w:r>
+    </w:p>
+    <w:p>
+      <w:pPr>
+        <w:spacing w:after="0" w:line="240" w:lineRule="auto"/>
+        <w:rPr>
+          <w:lang w:val="pt-BR"/>
+        </w:rPr>
+      </w:pPr>
+      <w:r>
+        <w:rPr>
+          <w:lang w:val="pt-BR"/>
+        </w:rPr>
+        <w:t>Nem toda ajuda vem do governo. Bancos, grandes bandeiras de cartão e aceleradoras cobrem lacunas onde o governo demora a responder:</w:t>
+      </w:r>
+    </w:p>
+    <w:p>
+      <w:pPr>
+        <w:numPr>
+          <w:ilvl w:val="0"/>
+          <w:numId w:val="13"/>
+        </w:numPr>
+        <w:spacing w:after="0" w:line="240" w:lineRule="auto"/>
+      </w:pPr>
+      <w:r>
+        <w:rPr>
+          <w:b/>
+          <w:bCs/>
+          <w:lang w:val="pt-BR"/>
+        </w:rPr>
+        <w:t>Bancos de Desenvolvimento:</w:t>
+      </w:r>
+      <w:r>
+        <w:rPr>
+          <w:lang w:val="pt-BR"/>
+        </w:rPr>
+        <w:t xml:space="preserve"> O </w:t>
+      </w:r>
+      <w:r>
+        <w:rPr>
+          <w:b/>
+          <w:bCs/>
+          <w:lang w:val="pt-BR"/>
+        </w:rPr>
+        <w:t>BDC (Business Development Bank of Canada)</w:t>
+      </w:r>
+      <w:r>
+        <w:rPr>
+          <w:lang w:val="pt-BR"/>
+        </w:rPr>
+        <w:t xml:space="preserve"> é uma instituição de apoio que lançou linhas de crédito específicas de R$ 1 bilhão para automação e produtividade das SMEs frente às crises globais. </w:t>
+      </w:r>
+      <w:r>
+        <w:t>[</w:t>
+      </w:r>
+      <w:hyperlink r:id="rId21" w:history="1">
+        <w:r>
+          <w:rPr>
+            <w:rStyle w:val="Hyperlink"/>
+          </w:rPr>
+          <w:t>1</w:t>
+        </w:r>
+      </w:hyperlink>
+      <w:r>
+        <w:t>]</w:t>
+      </w:r>
+    </w:p>
+    <w:p>
+      <w:pPr>
+        <w:numPr>
+          <w:ilvl w:val="0"/>
+          <w:numId w:val="13"/>
+        </w:numPr>
+        <w:spacing w:after="0" w:line="240" w:lineRule="auto"/>
+        <w:rPr>
+          <w:lang w:val="pt-BR"/>
+        </w:rPr>
+      </w:pPr>
+      <w:r>
+        <w:rPr>
+          <w:b/>
+          <w:bCs/>
+          <w:lang w:val="pt-BR"/>
+        </w:rPr>
+        <w:t>Programas de Nicho e Organizações Sem Fins Lucrativos:</w:t>
+      </w:r>
+    </w:p>
+    <w:p>
+      <w:pPr>
+        <w:numPr>
+          <w:ilvl w:val="1"/>
+          <w:numId w:val="13"/>
+        </w:numPr>
+        <w:spacing w:after="0" w:line="240" w:lineRule="auto"/>
+        <w:rPr>
+          <w:lang w:val="pt-BR"/>
+        </w:rPr>
+      </w:pPr>
+      <w:r>
+        <w:rPr>
+          <w:b/>
+          <w:bCs/>
+          <w:lang w:val="pt-BR"/>
+        </w:rPr>
+        <w:t>Futurpreneur Canada:</w:t>
+      </w:r>
+      <w:r>
+        <w:rPr>
+          <w:lang w:val="pt-BR"/>
+        </w:rPr>
+        <w:t xml:space="preserve"> Focado em jovens empreendedores (18 a 39 anos), oferecendo financiamento facilitado em parceria com o BDC e mentoria obrigatória por 2 anos.</w:t>
+      </w:r>
+    </w:p>
+    <w:p>
+      <w:pPr>
+        <w:numPr>
+          <w:ilvl w:val="1"/>
+          <w:numId w:val="13"/>
+        </w:numPr>
+        <w:spacing w:after="0" w:line="240" w:lineRule="auto"/>
+      </w:pPr>
+      <w:r>
+        <w:rPr>
+          <w:b/>
+          <w:bCs/>
+          <w:lang w:val="pt-BR"/>
+        </w:rPr>
+        <w:t>Programas de Diversidade:</w:t>
+      </w:r>
+      <w:r>
+        <w:rPr>
+          <w:lang w:val="pt-BR"/>
+        </w:rPr>
+        <w:t xml:space="preserve"> Fundos privados e subsídios corporativos focados em minorias, como o </w:t>
+      </w:r>
+      <w:r>
+        <w:rPr>
+          <w:i/>
+          <w:iCs/>
+          <w:lang w:val="pt-BR"/>
+        </w:rPr>
+        <w:t>Black Entrepreneurship Program</w:t>
+      </w:r>
+      <w:r>
+        <w:rPr>
+          <w:lang w:val="pt-BR"/>
+        </w:rPr>
+        <w:t xml:space="preserve"> ou o </w:t>
+      </w:r>
+      <w:r>
+        <w:rPr>
+          <w:i/>
+          <w:iCs/>
+          <w:lang w:val="pt-BR"/>
+        </w:rPr>
+        <w:t>Women Entrepreneurship Loan Fund</w:t>
+      </w:r>
+      <w:r>
+        <w:rPr>
+          <w:lang w:val="pt-BR"/>
+        </w:rPr>
+        <w:t xml:space="preserve">. Grandes corporações (como a Visa com o </w:t>
+      </w:r>
+      <w:r>
+        <w:rPr>
+          <w:i/>
+          <w:iCs/>
+          <w:lang w:val="pt-BR"/>
+        </w:rPr>
+        <w:t>She's Next</w:t>
+      </w:r>
+      <w:r>
+        <w:rPr>
+          <w:lang w:val="pt-BR"/>
+        </w:rPr>
+        <w:t xml:space="preserve">) também oferecem micro-grants e mentorias privadas. </w:t>
+      </w:r>
+      <w:r>
+        <w:t>[</w:t>
+      </w:r>
+      <w:hyperlink r:id="rId22" w:history="1">
+        <w:r>
+          <w:rPr>
+            <w:rStyle w:val="Hyperlink"/>
+          </w:rPr>
+          <w:t>1</w:t>
+        </w:r>
+      </w:hyperlink>
+      <w:r>
+        <w:t xml:space="preserve">, </w:t>
+      </w:r>
+      <w:hyperlink r:id="rId23" w:history="1">
+        <w:r>
+          <w:rPr>
+            <w:rStyle w:val="Hyperlink"/>
+          </w:rPr>
+          <w:t>2</w:t>
+        </w:r>
+      </w:hyperlink>
+      <w:r>
+        <w:t xml:space="preserve">, </w:t>
+      </w:r>
+      <w:hyperlink r:id="rId24" w:history="1">
+        <w:r>
+          <w:rPr>
+            <w:rStyle w:val="Hyperlink"/>
+          </w:rPr>
+          <w:t>3</w:t>
+        </w:r>
+      </w:hyperlink>
+      <w:r>
+        <w:t xml:space="preserve">, </w:t>
+      </w:r>
+      <w:hyperlink r:id="rId25" w:history="1">
+        <w:r>
+          <w:rPr>
+            <w:rStyle w:val="Hyperlink"/>
+          </w:rPr>
+          <w:t>4</w:t>
+        </w:r>
+      </w:hyperlink>
+      <w:r>
+        <w:t>]</w:t>
+      </w:r>
+    </w:p>
+    <w:p>
+      <w:pPr>
+        <w:spacing w:after="0" w:line="240" w:lineRule="auto"/>
+        <w:rPr>
+          <w:lang w:val="pt-BR"/>
+        </w:rPr>
+      </w:pPr>
+    </w:p>
+    <w:p>
+      <w:pPr>
+        <w:spacing w:after="0" w:line="240" w:lineRule="auto"/>
+        <w:rPr>
+          <w:b/>
+          <w:bCs/>
+          <w:lang w:val="pt-BR"/>
+        </w:rPr>
+      </w:pPr>
+      <w:r>
+        <w:rPr>
+          <w:b/>
+          <w:bCs/>
+          <w:lang w:val="pt-BR"/>
+        </w:rPr>
+        <w:t>4. Onde está a oportunidade para o seu App? (O Gap)</w:t>
+      </w:r>
+    </w:p>
+    <w:p>
+      <w:pPr>
+        <w:spacing w:after="0" w:line="240" w:lineRule="auto"/>
+        <w:rPr>
+          <w:lang w:val="pt-BR"/>
+        </w:rPr>
+      </w:pPr>
+      <w:r>
+        <w:rPr>
+          <w:lang w:val="pt-BR"/>
+        </w:rPr>
+        <w:t xml:space="preserve">O governo canadense tem uma ferramenta chamada </w:t>
+      </w:r>
+      <w:r>
+        <w:rPr>
+          <w:b/>
+          <w:bCs/>
+          <w:lang w:val="pt-BR"/>
+        </w:rPr>
+        <w:t>Business Benefits Finder</w:t>
+      </w:r>
+      <w:r>
+        <w:rPr>
+          <w:lang w:val="pt-BR"/>
+        </w:rPr>
+        <w:t xml:space="preserve">. O problema é que ela funciona como um </w:t>
+      </w:r>
+      <w:r>
+        <w:rPr>
+          <w:highlight w:val="yellow"/>
+          <w:lang w:val="pt-BR"/>
+        </w:rPr>
+        <w:t>formulário burocrático, longo e puramente textual</w:t>
+      </w:r>
+      <w:r>
+        <w:rPr>
+          <w:lang w:val="pt-BR"/>
+        </w:rPr>
+        <w:t>. [</w:t>
+      </w:r>
+      <w:hyperlink r:id="rId26" w:history="1">
+        <w:r>
+          <w:rPr>
+            <w:rStyle w:val="Hyperlink"/>
+            <w:lang w:val="pt-BR"/>
+          </w:rPr>
+          <w:t>1</w:t>
+        </w:r>
+      </w:hyperlink>
+      <w:r>
+        <w:rPr>
+          <w:lang w:val="pt-BR"/>
+        </w:rPr>
+        <w:t xml:space="preserve">, </w:t>
+      </w:r>
+      <w:hyperlink r:id="rId27" w:history="1">
+        <w:r>
+          <w:rPr>
+            <w:rStyle w:val="Hyperlink"/>
+            <w:lang w:val="pt-BR"/>
+          </w:rPr>
+          <w:t>2</w:t>
+        </w:r>
+      </w:hyperlink>
+      <w:r>
+        <w:rPr>
+          <w:lang w:val="pt-BR"/>
+        </w:rPr>
+        <w:t>]</w:t>
+      </w:r>
+    </w:p>
+    <w:p>
+      <w:pPr>
+        <w:spacing w:after="0" w:line="240" w:lineRule="auto"/>
+        <w:rPr>
+          <w:lang w:val="pt-BR"/>
+        </w:rPr>
+      </w:pPr>
+      <w:r>
+        <w:rPr>
+          <w:lang w:val="pt-BR"/>
+        </w:rPr>
+        <w:t xml:space="preserve">Muitos donos de pequenas empresas (como o dono de uma pequena fábrica em Ottawa ou uma empresa de transporte em Toronto) </w:t>
+      </w:r>
+      <w:r>
+        <w:rPr>
+          <w:b/>
+          <w:bCs/>
+          <w:lang w:val="pt-BR"/>
+        </w:rPr>
+        <w:t>não têm tempo</w:t>
+      </w:r>
+      <w:r>
+        <w:rPr>
+          <w:lang w:val="pt-BR"/>
+        </w:rPr>
+        <w:t xml:space="preserve"> de ler páginas imensas de critérios de elegibilidade jurídica ou regras de tarifas alfandegárias para saber se podem pedir o auxílio de mitigação de cadeias de suprimentos. </w:t>
+      </w:r>
+    </w:p>
+    <w:p>
+      <w:pPr>
+        <w:spacing w:after="0" w:line="240" w:lineRule="auto"/>
+        <w:rPr>
+          <w:lang w:val="pt-BR"/>
+        </w:rPr>
+      </w:pPr>
+    </w:p>
+    <w:p>
+      <w:pPr>
+        <w:spacing w:after="0" w:line="240" w:lineRule="auto"/>
+        <w:rPr>
+          <w:lang w:val="pt-BR"/>
+        </w:rPr>
+      </w:pPr>
+      <w:r>
+        <w:rPr>
+          <w:highlight w:val="yellow"/>
+          <w:lang w:val="pt-BR"/>
+        </w:rPr>
+        <w:t>Eles frequentemente recorrem a consultorias caríssimas apenas para descobrir a existência de um programa</w:t>
+      </w:r>
+      <w:r>
+        <w:rPr>
+          <w:lang w:val="pt-BR"/>
+        </w:rPr>
+        <w:t>. [</w:t>
+      </w:r>
+      <w:hyperlink r:id="rId28" w:history="1">
+        <w:r>
+          <w:rPr>
+            <w:rStyle w:val="Hyperlink"/>
+            <w:lang w:val="pt-BR"/>
+          </w:rPr>
+          <w:t>1</w:t>
+        </w:r>
+      </w:hyperlink>
+      <w:r>
+        <w:rPr>
+          <w:lang w:val="pt-BR"/>
+        </w:rPr>
+        <w:t>]</w:t>
+      </w:r>
+    </w:p>
+    <w:p>
+      <w:pPr>
+        <w:spacing w:after="0" w:line="240" w:lineRule="auto"/>
+        <w:rPr>
+          <w:lang w:val="pt-BR"/>
+        </w:rPr>
+      </w:pPr>
+    </w:p>
+    <w:p>
+      <w:pPr>
+        <w:spacing w:after="0" w:line="240" w:lineRule="auto"/>
+      </w:pPr>
+      <w:r>
+        <w:rPr>
+          <w:lang w:val="pt-BR"/>
+        </w:rPr>
+        <w:t xml:space="preserve">O seu aplicativo se posicionará como um </w:t>
+      </w:r>
+      <w:r>
+        <w:rPr>
+          <w:b/>
+          <w:bCs/>
+          <w:highlight w:val="yellow"/>
+          <w:lang w:val="pt-BR"/>
+        </w:rPr>
+        <w:t>agilizador inteligente (B2B)</w:t>
+      </w:r>
+      <w:r>
+        <w:rPr>
+          <w:highlight w:val="yellow"/>
+          <w:lang w:val="pt-BR"/>
+        </w:rPr>
+        <w:t>.</w:t>
+      </w:r>
+      <w:r>
+        <w:rPr>
+          <w:lang w:val="pt-BR"/>
+        </w:rPr>
+        <w:t xml:space="preserve"> O empresário responde de forma simples: "O que eu faço, onde estou, quantos funcionários tenho, e como fui afetado?" e o </w:t>
+      </w:r>
+      <w:r>
+        <w:rPr>
+          <w:highlight w:val="yellow"/>
+          <w:lang w:val="pt-BR"/>
+        </w:rPr>
+        <w:t>seu sistema cruza isso imediatamente com programas vitais, como o RTRI ou o CSBFP, entregando o caminho mastigado</w:t>
+      </w:r>
+      <w:r>
+        <w:rPr>
+          <w:lang w:val="pt-BR"/>
+        </w:rPr>
+        <w:t xml:space="preserve">. </w:t>
+      </w:r>
+      <w:r>
+        <w:t>[</w:t>
+      </w:r>
+      <w:hyperlink r:id="rId29" w:history="1">
+        <w:r>
+          <w:rPr>
+            <w:rStyle w:val="Hyperlink"/>
+          </w:rPr>
+          <w:t>1</w:t>
+        </w:r>
+      </w:hyperlink>
+      <w:r>
+        <w:t xml:space="preserve">, </w:t>
+      </w:r>
+      <w:hyperlink r:id="rId30" w:history="1">
+        <w:r>
+          <w:rPr>
+            <w:rStyle w:val="Hyperlink"/>
+          </w:rPr>
+          <w:t>2</w:t>
+        </w:r>
+      </w:hyperlink>
+      <w:r>
+        <w:t>]</w:t>
+      </w:r>
+    </w:p>
+    <w:p>
+      <w:pPr>
+        <w:spacing w:after="0" w:line="240" w:lineRule="auto"/>
+        <w:rPr>
+          <w:lang w:val="pt-BR"/>
+        </w:rPr>
+      </w:pPr>
+    </w:p>
+    <w:p>
+      <w:pPr>
+        <w:spacing w:after="0" w:line="240" w:lineRule="auto"/>
+        <w:rPr>
+          <w:lang w:val="pt-BR"/>
+        </w:rPr>
+      </w:pPr>
+      <w:r>
+        <w:rPr>
+          <w:lang w:val="pt-BR"/>
+        </w:rPr>
+        <w:t>____________________</w:t>
+      </w:r>
+    </w:p>
+    <w:p>
+      <w:pPr>
+        <w:spacing w:after="0" w:line="240" w:lineRule="auto"/>
+        <w:rPr>
+          <w:b/>
+          <w:bCs/>
+          <w:lang w:val="pt-BR"/>
+        </w:rPr>
+      </w:pPr>
+      <w:r>
+        <w:rPr>
+          <w:b/>
+          <w:bCs/>
+          <w:lang w:val="pt-BR"/>
+        </w:rPr>
+        <w:t>Business Benefits Finder</w:t>
+      </w:r>
+    </w:p>
+    <w:p>
+      <w:pPr>
+        <w:spacing w:after="0" w:line="240" w:lineRule="auto"/>
+        <w:rPr>
+          <w:lang w:val="pt-BR"/>
+        </w:rPr>
+      </w:pPr>
+    </w:p>
+    <w:p>
+      <w:pPr>
+        <w:spacing w:after="0" w:line="240" w:lineRule="auto"/>
+        <w:rPr>
+          <w:lang w:val="pt-BR"/>
+        </w:rPr>
+      </w:pPr>
+    </w:p>
+    <w:p>
+      <w:pPr>
+        <w:spacing w:after="0" w:line="240" w:lineRule="auto"/>
+        <w:rPr>
+          <w:lang w:val="pt-BR"/>
+        </w:rPr>
+      </w:pPr>
+      <w:r>
+        <w:rPr>
+          <w:noProof/>
+          <w:lang w:val="pt-BR"/>
+        </w:rPr>
+        <w:lastRenderedPageBreak/>
+        <w:drawing>
+          <wp:inline distT="0" distB="0" distL="0" distR="0" wp14:anchorId="4DF64367" wp14:editId="153A8332">
+            <wp:extent cx="5398770" cy="3347720"/>
+            <wp:effectExtent l="0" t="0" r="0" b="5080"/>
+            <wp:docPr id="1550062348" name="Picture 1"/>
+            <wp:cNvGraphicFramePr>
+              <a:graphicFrameLocks xmlns:a="http://schemas.openxmlformats.org/drawingml/2006/main" noChangeAspect="1"/>
+            </wp:cNvGraphicFramePr>
+            <a:graphic xmlns:a="http://schemas.openxmlformats.org/drawingml/2006/main">
+              <a:graphicData uri="http://schemas.openxmlformats.org/drawingml/2006/picture">
+                <pic:pic xmlns:pic="http://schemas.openxmlformats.org/drawingml/2006/picture">
+                  <pic:nvPicPr>
+                    <pic:cNvPr id="0" name="Picture 1"/>
+                    <pic:cNvPicPr>
+                      <a:picLocks noChangeAspect="1" noChangeArrowheads="1"/>
+                    </pic:cNvPicPr>
+                  </pic:nvPicPr>
+                  <pic:blipFill>
+                    <a:blip r:embed="rId31" cstate="print">
+                      <a:extLst>
+                        <a:ext uri="{28A0092B-C50C-407E-A947-70E740481C1C}">
+                          <a14:useLocalDpi xmlns:a14="http://schemas.microsoft.com/office/drawing/2010/main" val="0"/>
+                        </a:ext>
+                      </a:extLst>
+                    </a:blip>
+                    <a:srcRect/>
+                    <a:stretch>
+                      <a:fillRect/>
+                    </a:stretch>
+                  </pic:blipFill>
+                  <pic:spPr bwMode="auto">
+                    <a:xfrm>
+                      <a:off x="0" y="0"/>
+                      <a:ext cx="5398770" cy="3347720"/>
+                    </a:xfrm>
+                    <a:prstGeom prst="rect">
+                      <a:avLst/>
+                    </a:prstGeom>
+                    <a:noFill/>
+                    <a:ln>
+                      <a:noFill/>
+                    </a:ln>
+                  </pic:spPr>
+                </pic:pic>
+              </a:graphicData>
+            </a:graphic>
+          </wp:inline>
+        </w:drawing>
+      </w:r>
+    </w:p>
+    <w:p>
+      <w:pPr>
+        <w:spacing w:after="0" w:line="240" w:lineRule="auto"/>
+        <w:rPr>
+          <w:lang w:val="pt-BR"/>
+        </w:rPr>
+      </w:pPr>
+    </w:p>
+    <w:p>
+      <w:pPr>
+        <w:spacing w:after="0" w:line="240" w:lineRule="auto"/>
+        <w:rPr>
+          <w:lang w:val="pt-BR"/>
+        </w:rPr>
+      </w:pPr>
+      <w:r>
+        <w:rPr>
+          <w:noProof/>
+          <w:lang w:val="pt-BR"/>
+        </w:rPr>
+        <w:drawing>
+          <wp:inline distT="0" distB="0" distL="0" distR="0" wp14:anchorId="77FBC029" wp14:editId="6F89D197">
+            <wp:extent cx="5398770" cy="3474720"/>
+            <wp:effectExtent l="0" t="0" r="0" b="0"/>
+            <wp:docPr id="2051267334" name="Picture 2"/>
+            <wp:cNvGraphicFramePr>
+              <a:graphicFrameLocks xmlns:a="http://schemas.openxmlformats.org/drawingml/2006/main" noChangeAspect="1"/>
+            </wp:cNvGraphicFramePr>
+            <a:graphic xmlns:a="http://schemas.openxmlformats.org/drawingml/2006/main">
+              <a:graphicData uri="http://schemas.openxmlformats.org/drawingml/2006/picture">
+                <pic:pic xmlns:pic="http://schemas.openxmlformats.org/drawingml/2006/picture">
+                  <pic:nvPicPr>
+                    <pic:cNvPr id="0" name="Picture 2"/>
+                    <pic:cNvPicPr>
+                      <a:picLocks noChangeAspect="1" noChangeArrowheads="1"/>
+                    </pic:cNvPicPr>
+                  </pic:nvPicPr>
+                  <pic:blipFill>
+                    <a:blip r:embed="rId32" cstate="print">
+                      <a:extLst>
+                        <a:ext uri="{28A0092B-C50C-407E-A947-70E740481C1C}">
+                          <a14:useLocalDpi xmlns:a14="http://schemas.microsoft.com/office/drawing/2010/main" val="0"/>
+                        </a:ext>
+                      </a:extLst>
+                    </a:blip>
+                    <a:srcRect/>
+                    <a:stretch>
+                      <a:fillRect/>
+                    </a:stretch>
+                  </pic:blipFill>
+                  <pic:spPr bwMode="auto">
+                    <a:xfrm>
+                      <a:off x="0" y="0"/>
+                      <a:ext cx="5398770" cy="3474720"/>
+                    </a:xfrm>
+                    <a:prstGeom prst="rect">
+                      <a:avLst/>
+                    </a:prstGeom>
+                    <a:noFill/>
+                    <a:ln>
+                      <a:noFill/>
+                    </a:ln>
+                  </pic:spPr>
+                </pic:pic>
+              </a:graphicData>
+            </a:graphic>
+          </wp:inline>
+        </w:drawing>
+      </w:r>
+    </w:p>
+    <w:p>
+      <w:pPr>
+        <w:spacing w:after="0" w:line="240" w:lineRule="auto"/>
+        <w:rPr>
+          <w:lang w:val="pt-BR"/>
+        </w:rPr>
+      </w:pPr>
+    </w:p>
+    <w:p>
+      <w:pPr>
+        <w:spacing w:after="0" w:line="240" w:lineRule="auto"/>
+        <w:rPr>
+          <w:lang w:val="pt-BR"/>
+        </w:rPr>
+      </w:pPr>
+      <w:r>
+        <w:rPr>
+          <w:noProof/>
+          <w:lang w:val="pt-BR"/>
+        </w:rPr>
+        <w:lastRenderedPageBreak/>
+        <w:drawing>
+          <wp:inline distT="0" distB="0" distL="0" distR="0" wp14:anchorId="0E60D009" wp14:editId="7246BFB7">
+            <wp:extent cx="5398770" cy="3872230"/>
+            <wp:effectExtent l="0" t="0" r="0" b="0"/>
+            <wp:docPr id="2043759608" name="Picture 3"/>
+            <wp:cNvGraphicFramePr>
+              <a:graphicFrameLocks xmlns:a="http://schemas.openxmlformats.org/drawingml/2006/main" noChangeAspect="1"/>
+            </wp:cNvGraphicFramePr>
+            <a:graphic xmlns:a="http://schemas.openxmlformats.org/drawingml/2006/main">
+              <a:graphicData uri="http://schemas.openxmlformats.org/drawingml/2006/picture">
+                <pic:pic xmlns:pic="http://schemas.openxmlformats.org/drawingml/2006/picture">
+                  <pic:nvPicPr>
+                    <pic:cNvPr id="0" name="Picture 3"/>
+                    <pic:cNvPicPr>
+                      <a:picLocks noChangeAspect="1" noChangeArrowheads="1"/>
+                    </pic:cNvPicPr>
+                  </pic:nvPicPr>
+                  <pic:blipFill>
+                    <a:blip r:embed="rId33">
+                      <a:extLst>
+                        <a:ext uri="{28A0092B-C50C-407E-A947-70E740481C1C}">
+                          <a14:useLocalDpi xmlns:a14="http://schemas.microsoft.com/office/drawing/2010/main" val="0"/>
+                        </a:ext>
+                      </a:extLst>
+                    </a:blip>
+                    <a:srcRect/>
+                    <a:stretch>
+                      <a:fillRect/>
+                    </a:stretch>
+                  </pic:blipFill>
+                  <pic:spPr bwMode="auto">
+                    <a:xfrm>
+                      <a:off x="0" y="0"/>
+                      <a:ext cx="5398770" cy="3872230"/>
+                    </a:xfrm>
+                    <a:prstGeom prst="rect">
+                      <a:avLst/>
+                    </a:prstGeom>
+                    <a:noFill/>
+                    <a:ln>
+                      <a:noFill/>
+                    </a:ln>
+                  </pic:spPr>
+                </pic:pic>
+              </a:graphicData>
+            </a:graphic>
+          </wp:inline>
+        </w:drawing>
+      </w:r>
+    </w:p>
+    <w:p>
+      <w:pPr>
+        <w:spacing w:after="0" w:line="240" w:lineRule="auto"/>
+        <w:rPr>
+          <w:lang w:val="pt-BR"/>
+        </w:rPr>
+      </w:pPr>
+    </w:p>
+    <w:p>
+      <w:pPr>
+        <w:spacing w:after="0" w:line="240" w:lineRule="auto"/>
+        <w:rPr>
+          <w:lang w:val="pt-BR"/>
+        </w:rPr>
+      </w:pPr>
+      <w:r>
+        <w:rPr>
+          <w:noProof/>
+          <w:lang w:val="pt-BR"/>
+        </w:rPr>
+        <w:drawing>
+          <wp:inline distT="0" distB="0" distL="0" distR="0" wp14:anchorId="512DA8CD" wp14:editId="196FBB09">
+            <wp:extent cx="5391150" cy="3498850"/>
+            <wp:effectExtent l="0" t="0" r="0" b="6350"/>
+            <wp:docPr id="1132507606" name="Picture 4"/>
+            <wp:cNvGraphicFramePr>
+              <a:graphicFrameLocks xmlns:a="http://schemas.openxmlformats.org/drawingml/2006/main" noChangeAspect="1"/>
+            </wp:cNvGraphicFramePr>
+            <a:graphic xmlns:a="http://schemas.openxmlformats.org/drawingml/2006/main">
+              <a:graphicData uri="http://schemas.openxmlformats.org/drawingml/2006/picture">
+                <pic:pic xmlns:pic="http://schemas.openxmlformats.org/drawingml/2006/picture">
+                  <pic:nvPicPr>
+                    <pic:cNvPr id="0" name="Picture 4"/>
+                    <pic:cNvPicPr>
+                      <a:picLocks noChangeAspect="1" noChangeArrowheads="1"/>
+                    </pic:cNvPicPr>
+                  </pic:nvPicPr>
+                  <pic:blipFill>
+                    <a:blip r:embed="rId34" cstate="print">
+                      <a:extLst>
+                        <a:ext uri="{28A0092B-C50C-407E-A947-70E740481C1C}">
+                          <a14:useLocalDpi xmlns:a14="http://schemas.microsoft.com/office/drawing/2010/main" val="0"/>
+                        </a:ext>
+                      </a:extLst>
+                    </a:blip>
+                    <a:srcRect/>
+                    <a:stretch>
+                      <a:fillRect/>
+                    </a:stretch>
+                  </pic:blipFill>
+                  <pic:spPr bwMode="auto">
+                    <a:xfrm>
+                      <a:off x="0" y="0"/>
+                      <a:ext cx="5391150" cy="3498850"/>
+                    </a:xfrm>
+                    <a:prstGeom prst="rect">
+                      <a:avLst/>
+                    </a:prstGeom>
+                    <a:noFill/>
+                    <a:ln>
+                      <a:noFill/>
+                    </a:ln>
+                  </pic:spPr>
+                </pic:pic>
+              </a:graphicData>
+            </a:graphic>
+          </wp:inline>
+        </w:drawing>
+      </w:r>
+    </w:p>
+    <w:p>
+      <w:pPr>
+        <w:spacing w:after="0" w:line="240" w:lineRule="auto"/>
+        <w:rPr>
+          <w:lang w:val="pt-BR"/>
+        </w:rPr>
+      </w:pPr>
+    </w:p>
+    <w:p>
+      <w:pPr>
+        <w:spacing w:after="0" w:line="240" w:lineRule="auto"/>
+        <w:rPr>
+          <w:lang w:val="pt-BR"/>
+        </w:rPr>
+      </w:pPr>
+      <w:r>
+        <w:rPr>
+          <w:noProof/>
+          <w:lang w:val="pt-BR"/>
+        </w:rPr>
+        <w:lastRenderedPageBreak/>
+        <w:drawing>
+          <wp:inline distT="0" distB="0" distL="0" distR="0" wp14:anchorId="6A299290" wp14:editId="67184B48">
+            <wp:extent cx="5391150" cy="3768725"/>
+            <wp:effectExtent l="0" t="0" r="0" b="3175"/>
+            <wp:docPr id="544122508" name="Picture 5"/>
+            <wp:cNvGraphicFramePr>
+              <a:graphicFrameLocks xmlns:a="http://schemas.openxmlformats.org/drawingml/2006/main" noChangeAspect="1"/>
+            </wp:cNvGraphicFramePr>
+            <a:graphic xmlns:a="http://schemas.openxmlformats.org/drawingml/2006/main">
+              <a:graphicData uri="http://schemas.openxmlformats.org/drawingml/2006/picture">
+                <pic:pic xmlns:pic="http://schemas.openxmlformats.org/drawingml/2006/picture">
+                  <pic:nvPicPr>
+                    <pic:cNvPr id="0" name="Picture 5"/>
+                    <pic:cNvPicPr>
+                      <a:picLocks noChangeAspect="1" noChangeArrowheads="1"/>
+                    </pic:cNvPicPr>
+                  </pic:nvPicPr>
+                  <pic:blipFill>
+                    <a:blip r:embed="rId35">
+                      <a:extLst>
+                        <a:ext uri="{28A0092B-C50C-407E-A947-70E740481C1C}">
+                          <a14:useLocalDpi xmlns:a14="http://schemas.microsoft.com/office/drawing/2010/main" val="0"/>
+                        </a:ext>
+                      </a:extLst>
+                    </a:blip>
+                    <a:srcRect/>
+                    <a:stretch>
+                      <a:fillRect/>
+                    </a:stretch>
+                  </pic:blipFill>
+                  <pic:spPr bwMode="auto">
+                    <a:xfrm>
+                      <a:off x="0" y="0"/>
+                      <a:ext cx="5391150" cy="3768725"/>
+                    </a:xfrm>
+                    <a:prstGeom prst="rect">
+                      <a:avLst/>
+                    </a:prstGeom>
+                    <a:noFill/>
+                    <a:ln>
+                      <a:noFill/>
+                    </a:ln>
+                  </pic:spPr>
+                </pic:pic>
+              </a:graphicData>
+            </a:graphic>
+          </wp:inline>
+        </w:drawing>
+      </w:r>
+    </w:p>
+    <w:p>
+      <w:pPr>
+        <w:spacing w:after="0" w:line="240" w:lineRule="auto"/>
+        <w:rPr>
+          <w:lang w:val="pt-BR"/>
+        </w:rPr>
+      </w:pPr>
+      <w:r>
+        <w:rPr>
+          <w:noProof/>
+          <w:lang w:val="pt-BR"/>
+        </w:rPr>
+        <w:drawing>
+          <wp:inline distT="0" distB="0" distL="0" distR="0" wp14:anchorId="1EFD8E54" wp14:editId="3075176E">
+            <wp:extent cx="5398770" cy="3546475"/>
+            <wp:effectExtent l="0" t="0" r="0" b="0"/>
+            <wp:docPr id="800751482" name="Picture 6"/>
+            <wp:cNvGraphicFramePr>
+              <a:graphicFrameLocks xmlns:a="http://schemas.openxmlformats.org/drawingml/2006/main" noChangeAspect="1"/>
+            </wp:cNvGraphicFramePr>
+            <a:graphic xmlns:a="http://schemas.openxmlformats.org/drawingml/2006/main">
+              <a:graphicData uri="http://schemas.openxmlformats.org/drawingml/2006/picture">
+                <pic:pic xmlns:pic="http://schemas.openxmlformats.org/drawingml/2006/picture">
+                  <pic:nvPicPr>
+                    <pic:cNvPr id="0" name="Picture 6"/>
+                    <pic:cNvPicPr>
+                      <a:picLocks noChangeAspect="1" noChangeArrowheads="1"/>
+                    </pic:cNvPicPr>
+                  </pic:nvPicPr>
+                  <pic:blipFill>
+                    <a:blip r:embed="rId36">
+                      <a:extLst>
+                        <a:ext uri="{28A0092B-C50C-407E-A947-70E740481C1C}">
+                          <a14:useLocalDpi xmlns:a14="http://schemas.microsoft.com/office/drawing/2010/main" val="0"/>
+                        </a:ext>
+                      </a:extLst>
+                    </a:blip>
+                    <a:srcRect/>
+                    <a:stretch>
+                      <a:fillRect/>
+                    </a:stretch>
+                  </pic:blipFill>
+                  <pic:spPr bwMode="auto">
+                    <a:xfrm>
+                      <a:off x="0" y="0"/>
+                      <a:ext cx="5398770" cy="3546475"/>
+                    </a:xfrm>
+                    <a:prstGeom prst="rect">
+                      <a:avLst/>
+                    </a:prstGeom>
+                    <a:noFill/>
+                    <a:ln>
+                      <a:noFill/>
+                    </a:ln>
+                  </pic:spPr>
+                </pic:pic>
+              </a:graphicData>
+            </a:graphic>
+          </wp:inline>
+        </w:drawing>
+      </w:r>
+    </w:p>
+    <w:p>
+      <w:pPr>
+        <w:spacing w:after="0" w:line="240" w:lineRule="auto"/>
+        <w:rPr>
+          <w:lang w:val="pt-BR"/>
+        </w:rPr>
+      </w:pPr>
+    </w:p>
+    <w:p>
+      <w:pPr>
+        <w:spacing w:after="0" w:line="240" w:lineRule="auto"/>
+        <w:rPr>
+          <w:lang w:val="pt-BR"/>
+        </w:rPr>
+      </w:pPr>
+      <w:r>
+        <w:rPr>
+          <w:noProof/>
+          <w:lang w:val="pt-BR"/>
+        </w:rPr>
+        <w:lastRenderedPageBreak/>
+        <w:drawing>
+          <wp:inline distT="0" distB="0" distL="0" distR="0" wp14:anchorId="1BC27D5D" wp14:editId="43333759">
+            <wp:extent cx="5391150" cy="3442970"/>
+            <wp:effectExtent l="0" t="0" r="0" b="5080"/>
+            <wp:docPr id="799757004" name="Picture 7"/>
+            <wp:cNvGraphicFramePr>
+              <a:graphicFrameLocks xmlns:a="http://schemas.openxmlformats.org/drawingml/2006/main" noChangeAspect="1"/>
+            </wp:cNvGraphicFramePr>
+            <a:graphic xmlns:a="http://schemas.openxmlformats.org/drawingml/2006/main">
+              <a:graphicData uri="http://schemas.openxmlformats.org/drawingml/2006/picture">
+                <pic:pic xmlns:pic="http://schemas.openxmlformats.org/drawingml/2006/picture">
+                  <pic:nvPicPr>
+                    <pic:cNvPr id="0" name="Picture 7"/>
+                    <pic:cNvPicPr>
+                      <a:picLocks noChangeAspect="1" noChangeArrowheads="1"/>
+                    </pic:cNvPicPr>
+                  </pic:nvPicPr>
+                  <pic:blipFill>
+                    <a:blip r:embed="rId37">
+                      <a:extLst>
+                        <a:ext uri="{28A0092B-C50C-407E-A947-70E740481C1C}">
+                          <a14:useLocalDpi xmlns:a14="http://schemas.microsoft.com/office/drawing/2010/main" val="0"/>
+                        </a:ext>
+                      </a:extLst>
+                    </a:blip>
+                    <a:srcRect/>
+                    <a:stretch>
+                      <a:fillRect/>
+                    </a:stretch>
+                  </pic:blipFill>
+                  <pic:spPr bwMode="auto">
+                    <a:xfrm>
+                      <a:off x="0" y="0"/>
+                      <a:ext cx="5391150" cy="3442970"/>
+                    </a:xfrm>
+                    <a:prstGeom prst="rect">
+                      <a:avLst/>
+                    </a:prstGeom>
+                    <a:noFill/>
+                    <a:ln>
+                      <a:noFill/>
+                    </a:ln>
+                  </pic:spPr>
+                </pic:pic>
+              </a:graphicData>
+            </a:graphic>
+          </wp:inline>
+        </w:drawing>
+      </w:r>
+    </w:p>
+    <w:p>
+      <w:pPr>
+        <w:spacing w:after="0" w:line="240" w:lineRule="auto"/>
+        <w:rPr>
+          <w:lang w:val="pt-BR"/>
+        </w:rPr>
+      </w:pPr>
+    </w:p>
+    <w:p>
+      <w:pPr>
+        <w:spacing w:after="0" w:line="240" w:lineRule="auto"/>
+        <w:rPr>
+          <w:lang w:val="pt-BR"/>
+        </w:rPr>
+      </w:pPr>
+      <w:r>
+        <w:rPr>
+          <w:noProof/>
+          <w:lang w:val="pt-BR"/>
+        </w:rPr>
+        <w:drawing>
+          <wp:inline distT="0" distB="0" distL="0" distR="0" wp14:anchorId="5AD58680" wp14:editId="190CC1B3">
+            <wp:extent cx="5398770" cy="3418840"/>
+            <wp:effectExtent l="0" t="0" r="0" b="0"/>
+            <wp:docPr id="621628081" name="Picture 8"/>
+            <wp:cNvGraphicFramePr>
+              <a:graphicFrameLocks xmlns:a="http://schemas.openxmlformats.org/drawingml/2006/main" noChangeAspect="1"/>
+            </wp:cNvGraphicFramePr>
+            <a:graphic xmlns:a="http://schemas.openxmlformats.org/drawingml/2006/main">
+              <a:graphicData uri="http://schemas.openxmlformats.org/drawingml/2006/picture">
+                <pic:pic xmlns:pic="http://schemas.openxmlformats.org/drawingml/2006/picture">
+                  <pic:nvPicPr>
+                    <pic:cNvPr id="0" name="Picture 8"/>
+                    <pic:cNvPicPr>
+                      <a:picLocks noChangeAspect="1" noChangeArrowheads="1"/>
+                    </pic:cNvPicPr>
+                  </pic:nvPicPr>
+                  <pic:blipFill>
+                    <a:blip r:embed="rId38" cstate="print">
+                      <a:extLst>
+                        <a:ext uri="{28A0092B-C50C-407E-A947-70E740481C1C}">
+                          <a14:useLocalDpi xmlns:a14="http://schemas.microsoft.com/office/drawing/2010/main" val="0"/>
+                        </a:ext>
+                      </a:extLst>
+                    </a:blip>
+                    <a:srcRect/>
+                    <a:stretch>
+                      <a:fillRect/>
+                    </a:stretch>
+                  </pic:blipFill>
+                  <pic:spPr bwMode="auto">
+                    <a:xfrm>
+                      <a:off x="0" y="0"/>
+                      <a:ext cx="5398770" cy="3418840"/>
+                    </a:xfrm>
+                    <a:prstGeom prst="rect">
+                      <a:avLst/>
+                    </a:prstGeom>
+                    <a:noFill/>
+                    <a:ln>
+                      <a:noFill/>
+                    </a:ln>
+                  </pic:spPr>
+                </pic:pic>
+              </a:graphicData>
+            </a:graphic>
+          </wp:inline>
+        </w:drawing>
+      </w:r>
+    </w:p>
+    <w:p>
+      <w:pPr>
+        <w:spacing w:after="0" w:line="240" w:lineRule="auto"/>
+        <w:rPr>
+          <w:lang w:val="pt-BR"/>
+        </w:rPr>
+      </w:pPr>
+    </w:p>
+    <w:p>
+      <w:pPr>
+        <w:spacing w:after="0" w:line="240" w:lineRule="auto"/>
+        <w:rPr>
+          <w:lang w:val="pt-BR"/>
+        </w:rPr>
+      </w:pPr>
+      <w:r>
+        <w:rPr>
+          <w:noProof/>
+          <w:lang w:val="pt-BR"/>
+        </w:rPr>
+        <w:lastRenderedPageBreak/>
+        <w:drawing>
+          <wp:inline distT="0" distB="0" distL="0" distR="0" wp14:anchorId="044258ED" wp14:editId="5D240ADF">
+            <wp:extent cx="5391150" cy="3133090"/>
+            <wp:effectExtent l="0" t="0" r="0" b="0"/>
+            <wp:docPr id="1560261958" name="Picture 9"/>
+            <wp:cNvGraphicFramePr>
+              <a:graphicFrameLocks xmlns:a="http://schemas.openxmlformats.org/drawingml/2006/main" noChangeAspect="1"/>
+            </wp:cNvGraphicFramePr>
+            <a:graphic xmlns:a="http://schemas.openxmlformats.org/drawingml/2006/main">
+              <a:graphicData uri="http://schemas.openxmlformats.org/drawingml/2006/picture">
+                <pic:pic xmlns:pic="http://schemas.openxmlformats.org/drawingml/2006/picture">
+                  <pic:nvPicPr>
+                    <pic:cNvPr id="0" name="Picture 9"/>
+                    <pic:cNvPicPr>
+                      <a:picLocks noChangeAspect="1" noChangeArrowheads="1"/>
+                    </pic:cNvPicPr>
+                  </pic:nvPicPr>
+                  <pic:blipFill>
+                    <a:blip r:embed="rId39">
+                      <a:extLst>
+                        <a:ext uri="{28A0092B-C50C-407E-A947-70E740481C1C}">
+                          <a14:useLocalDpi xmlns:a14="http://schemas.microsoft.com/office/drawing/2010/main" val="0"/>
+                        </a:ext>
+                      </a:extLst>
+                    </a:blip>
+                    <a:srcRect/>
+                    <a:stretch>
+                      <a:fillRect/>
+                    </a:stretch>
+                  </pic:blipFill>
+                  <pic:spPr bwMode="auto">
+                    <a:xfrm>
+                      <a:off x="0" y="0"/>
+                      <a:ext cx="5391150" cy="3133090"/>
+                    </a:xfrm>
+                    <a:prstGeom prst="rect">
+                      <a:avLst/>
+                    </a:prstGeom>
+                    <a:noFill/>
+                    <a:ln>
+                      <a:noFill/>
+                    </a:ln>
+                  </pic:spPr>
+                </pic:pic>
+              </a:graphicData>
+            </a:graphic>
+          </wp:inline>
+        </w:drawing>
+      </w:r>
+    </w:p>
+    <w:p>
+      <w:pPr>
+        <w:spacing w:after="0" w:line="240" w:lineRule="auto"/>
+        <w:rPr>
+          <w:lang w:val="pt-BR"/>
+        </w:rPr>
+      </w:pPr>
+    </w:p>
+    <w:p>
+      <w:pPr>
+        <w:spacing w:after="0" w:line="240" w:lineRule="auto"/>
+        <w:rPr>
+          <w:lang w:val="pt-BR"/>
+        </w:rPr>
+      </w:pPr>
+      <w:r>
+        <w:rPr>
+          <w:noProof/>
+          <w:lang w:val="pt-BR"/>
+        </w:rPr>
+        <w:drawing>
+          <wp:inline distT="0" distB="0" distL="0" distR="0" wp14:anchorId="505A5A79" wp14:editId="2C807216">
+            <wp:extent cx="5391150" cy="3164840"/>
+            <wp:effectExtent l="0" t="0" r="0" b="0"/>
+            <wp:docPr id="1903458942" name="Picture 10"/>
+            <wp:cNvGraphicFramePr>
+              <a:graphicFrameLocks xmlns:a="http://schemas.openxmlformats.org/drawingml/2006/main" noChangeAspect="1"/>
+            </wp:cNvGraphicFramePr>
+            <a:graphic xmlns:a="http://schemas.openxmlformats.org/drawingml/2006/main">
+              <a:graphicData uri="http://schemas.openxmlformats.org/drawingml/2006/picture">
+                <pic:pic xmlns:pic="http://schemas.openxmlformats.org/drawingml/2006/picture">
+                  <pic:nvPicPr>
+                    <pic:cNvPr id="0" name="Picture 10"/>
+                    <pic:cNvPicPr>
+                      <a:picLocks noChangeAspect="1" noChangeArrowheads="1"/>
+                    </pic:cNvPicPr>
+                  </pic:nvPicPr>
+                  <pic:blipFill>
+                    <a:blip r:embed="rId40" cstate="print">
+                      <a:extLst>
+                        <a:ext uri="{28A0092B-C50C-407E-A947-70E740481C1C}">
+                          <a14:useLocalDpi xmlns:a14="http://schemas.microsoft.com/office/drawing/2010/main" val="0"/>
+                        </a:ext>
+                      </a:extLst>
+                    </a:blip>
+                    <a:srcRect/>
+                    <a:stretch>
+                      <a:fillRect/>
+                    </a:stretch>
+                  </pic:blipFill>
+                  <pic:spPr bwMode="auto">
+                    <a:xfrm>
+                      <a:off x="0" y="0"/>
+                      <a:ext cx="5391150" cy="3164840"/>
+                    </a:xfrm>
+                    <a:prstGeom prst="rect">
+                      <a:avLst/>
+                    </a:prstGeom>
+                    <a:noFill/>
+                    <a:ln>
+                      <a:noFill/>
+                    </a:ln>
+                  </pic:spPr>
+                </pic:pic>
+              </a:graphicData>
+            </a:graphic>
+          </wp:inline>
+        </w:drawing>
+      </w:r>
+    </w:p>
+    <w:p>
+      <w:pPr>
+        <w:spacing w:after="0" w:line="240" w:lineRule="auto"/>
+        <w:rPr>
+          <w:lang w:val="pt-BR"/>
+        </w:rPr>
+      </w:pPr>
+      <w:r>
+        <w:rPr>
+          <w:noProof/>
+          <w:lang w:val="pt-BR"/>
+        </w:rPr>
+        <w:lastRenderedPageBreak/>
+        <w:drawing>
+          <wp:inline distT="0" distB="0" distL="0" distR="0" wp14:anchorId="6272CC3D" wp14:editId="7ACBD35C">
+            <wp:extent cx="5398770" cy="4683125"/>
+            <wp:effectExtent l="0" t="0" r="0" b="3175"/>
+            <wp:docPr id="907888205" name="Picture 11"/>
+            <wp:cNvGraphicFramePr>
+              <a:graphicFrameLocks xmlns:a="http://schemas.openxmlformats.org/drawingml/2006/main" noChangeAspect="1"/>
+            </wp:cNvGraphicFramePr>
+            <a:graphic xmlns:a="http://schemas.openxmlformats.org/drawingml/2006/main">
+              <a:graphicData uri="http://schemas.openxmlformats.org/drawingml/2006/picture">
+                <pic:pic xmlns:pic="http://schemas.openxmlformats.org/drawingml/2006/picture">
+                  <pic:nvPicPr>
+                    <pic:cNvPr id="0" name="Picture 11"/>
+                    <pic:cNvPicPr>
+                      <a:picLocks noChangeAspect="1" noChangeArrowheads="1"/>
+                    </pic:cNvPicPr>
+                  </pic:nvPicPr>
+                  <pic:blipFill>
+                    <a:blip r:embed="rId41">
+                      <a:extLst>
+                        <a:ext uri="{28A0092B-C50C-407E-A947-70E740481C1C}">
+                          <a14:useLocalDpi xmlns:a14="http://schemas.microsoft.com/office/drawing/2010/main" val="0"/>
+                        </a:ext>
+                      </a:extLst>
+                    </a:blip>
+                    <a:srcRect/>
+                    <a:stretch>
+                      <a:fillRect/>
+                    </a:stretch>
+                  </pic:blipFill>
+                  <pic:spPr bwMode="auto">
+                    <a:xfrm>
+                      <a:off x="0" y="0"/>
+                      <a:ext cx="5398770" cy="4683125"/>
+                    </a:xfrm>
+                    <a:prstGeom prst="rect">
+                      <a:avLst/>
+                    </a:prstGeom>
+                    <a:noFill/>
+                    <a:ln>
+                      <a:noFill/>
+                    </a:ln>
+                  </pic:spPr>
+                </pic:pic>
+              </a:graphicData>
+            </a:graphic>
+          </wp:inline>
+        </w:drawing>
+      </w:r>
+    </w:p>
+    <w:p>
+      <w:pPr>
+        <w:spacing w:after="0" w:line="240" w:lineRule="auto"/>
+        <w:rPr>
+          <w:lang w:val="pt-BR"/>
+        </w:rPr>
+      </w:pPr>
+    </w:p>
+    <w:p>
+      <w:pPr>
+        <w:spacing w:after="0" w:line="240" w:lineRule="auto"/>
+        <w:rPr>
+          <w:lang w:val="pt-BR"/>
+        </w:rPr>
+      </w:pPr>
+      <w:r>
+        <w:rPr>
+          <w:noProof/>
+        </w:rPr>
+        <w:drawing>
+          <wp:inline distT="0" distB="0" distL="0" distR="0" wp14:anchorId="534BF7AD" wp14:editId="5191174B">
+            <wp:extent cx="5400040" cy="3037840"/>
+            <wp:effectExtent l="0" t="0" r="0" b="0"/>
+            <wp:docPr id="1132419681" name="Picture 1"/>
+            <wp:cNvGraphicFramePr>
+              <a:graphicFrameLocks xmlns:a="http://schemas.openxmlformats.org/drawingml/2006/main" noChangeAspect="1"/>
+            </wp:cNvGraphicFramePr>
+            <a:graphic xmlns:a="http://schemas.openxmlformats.org/drawingml/2006/main">
+              <a:graphicData uri="http://schemas.openxmlformats.org/drawingml/2006/picture">
+                <pic:pic xmlns:pic="http://schemas.openxmlformats.org/drawingml/2006/picture">
+                  <pic:nvPicPr>
+                    <pic:cNvPr id="1132419681" name=""/>
+                    <pic:cNvPicPr/>
+                  </pic:nvPicPr>
+                  <pic:blipFill>
+                    <a:blip r:embed="rId42"/>
+                    <a:stretch>
+                      <a:fillRect/>
+                    </a:stretch>
+                  </pic:blipFill>
+                  <pic:spPr>
+                    <a:xfrm>
+                      <a:off x="0" y="0"/>
+                      <a:ext cx="5400040" cy="3037840"/>
+                    </a:xfrm>
+                    <a:prstGeom prst="rect">
+                      <a:avLst/>
+                    </a:prstGeom>
+                  </pic:spPr>
+                </pic:pic>
+              </a:graphicData>
+            </a:graphic>
+          </wp:inline>
+        </w:drawing>
+      </w:r>
+    </w:p>
+    <w:p>
+      <w:pPr>
+        <w:spacing w:after="0" w:line="240" w:lineRule="auto"/>
+        <w:rPr>
+          <w:lang w:val="pt-BR"/>
+        </w:rPr>
+      </w:pPr>
+    </w:p>
+    <w:p>
+      <w:pPr>
+        <w:spacing w:after="0" w:line="240" w:lineRule="auto"/>
+        <w:rPr>
+          <w:lang w:val="pt-BR"/>
+        </w:rPr>
+      </w:pPr>
+    </w:p>
+    <w:p>
+      <w:pPr>
+        <w:spacing w:after="0" w:line="240" w:lineRule="auto"/>
+        <w:rPr>
+          <w:lang w:val="pt-BR"/>
+        </w:rPr>
+      </w:pPr>
+      <w:r>
+        <w:rPr>
+          <w:noProof/>
+        </w:rPr>
+        <w:lastRenderedPageBreak/>
+        <w:drawing>
+          <wp:inline distT="0" distB="0" distL="0" distR="0" wp14:anchorId="4570FBA8" wp14:editId="1B0066D9">
+            <wp:extent cx="5400040" cy="3037840"/>
+            <wp:effectExtent l="0" t="0" r="0" b="0"/>
+            <wp:docPr id="888751163" name="Picture 1"/>
+            <wp:cNvGraphicFramePr>
+              <a:graphicFrameLocks xmlns:a="http://schemas.openxmlformats.org/drawingml/2006/main" noChangeAspect="1"/>
+            </wp:cNvGraphicFramePr>
+            <a:graphic xmlns:a="http://schemas.openxmlformats.org/drawingml/2006/main">
+              <a:graphicData uri="http://schemas.openxmlformats.org/drawingml/2006/picture">
+                <pic:pic xmlns:pic="http://schemas.openxmlformats.org/drawingml/2006/picture">
+                  <pic:nvPicPr>
+                    <pic:cNvPr id="888751163" name=""/>
+                    <pic:cNvPicPr/>
+                  </pic:nvPicPr>
+                  <pic:blipFill>
+                    <a:blip r:embed="rId43"/>
+                    <a:stretch>
+                      <a:fillRect/>
+                    </a:stretch>
+                  </pic:blipFill>
+                  <pic:spPr>
+                    <a:xfrm>
+                      <a:off x="0" y="0"/>
+                      <a:ext cx="5400040" cy="3037840"/>
+                    </a:xfrm>
+                    <a:prstGeom prst="rect">
+                      <a:avLst/>
+                    </a:prstGeom>
+                  </pic:spPr>
+                </pic:pic>
+              </a:graphicData>
+            </a:graphic>
+          </wp:inline>
+        </w:drawing>
+      </w:r>
+    </w:p>
+    <w:p>
+      <w:pPr>
+        <w:spacing w:after="0" w:line="240" w:lineRule="auto"/>
+        <w:rPr>
+          <w:lang w:val="pt-BR"/>
+        </w:rPr>
+      </w:pPr>
+    </w:p>
+    <w:p>
+      <w:pPr>
+        <w:spacing w:after="0" w:line="240" w:lineRule="auto"/>
+        <w:rPr>
+          <w:lang w:val="pt-BR"/>
+        </w:rPr>
+      </w:pPr>
+      <w:r>
+        <w:rPr>
+          <w:noProof/>
+        </w:rPr>
+        <w:drawing>
+          <wp:inline distT="0" distB="0" distL="0" distR="0" wp14:anchorId="6C4F74E9" wp14:editId="7ED836C7">
+            <wp:extent cx="5400040" cy="3037840"/>
+            <wp:effectExtent l="0" t="0" r="0" b="0"/>
+            <wp:docPr id="754222630" name="Picture 1"/>
+            <wp:cNvGraphicFramePr>
+              <a:graphicFrameLocks xmlns:a="http://schemas.openxmlformats.org/drawingml/2006/main" noChangeAspect="1"/>
+            </wp:cNvGraphicFramePr>
+            <a:graphic xmlns:a="http://schemas.openxmlformats.org/drawingml/2006/main">
+              <a:graphicData uri="http://schemas.openxmlformats.org/drawingml/2006/picture">
+                <pic:pic xmlns:pic="http://schemas.openxmlformats.org/drawingml/2006/picture">
+                  <pic:nvPicPr>
+                    <pic:cNvPr id="754222630" name=""/>
+                    <pic:cNvPicPr/>
+                  </pic:nvPicPr>
+                  <pic:blipFill>
+                    <a:blip r:embed="rId44"/>
+                    <a:stretch>
+                      <a:fillRect/>
+                    </a:stretch>
+                  </pic:blipFill>
+                  <pic:spPr>
+                    <a:xfrm>
+                      <a:off x="0" y="0"/>
+                      <a:ext cx="5400040" cy="3037840"/>
+                    </a:xfrm>
+                    <a:prstGeom prst="rect">
+                      <a:avLst/>
+                    </a:prstGeom>
+                  </pic:spPr>
+                </pic:pic>
+              </a:graphicData>
+            </a:graphic>
+          </wp:inline>
+        </w:drawing>
+      </w:r>
+    </w:p>
+    <w:p>
+      <w:pPr>
+        <w:spacing w:after="0" w:line="240" w:lineRule="auto"/>
+        <w:rPr>
+          <w:lang w:val="pt-BR"/>
+        </w:rPr>
+      </w:pPr>
+      <w:r>
+        <w:rPr>
+          <w:noProof/>
+        </w:rPr>
+        <w:lastRenderedPageBreak/>
+        <w:drawing>
+          <wp:inline distT="0" distB="0" distL="0" distR="0" wp14:anchorId="61235A37" wp14:editId="08608399">
+            <wp:extent cx="5400040" cy="3037840"/>
+            <wp:effectExtent l="0" t="0" r="0" b="0"/>
+            <wp:docPr id="1861149701" name="Picture 1"/>
+            <wp:cNvGraphicFramePr>
+              <a:graphicFrameLocks xmlns:a="http://schemas.openxmlformats.org/drawingml/2006/main" noChangeAspect="1"/>
+            </wp:cNvGraphicFramePr>
+            <a:graphic xmlns:a="http://schemas.openxmlformats.org/drawingml/2006/main">
+              <a:graphicData uri="http://schemas.openxmlformats.org/drawingml/2006/picture">
+                <pic:pic xmlns:pic="http://schemas.openxmlformats.org/drawingml/2006/picture">
+                  <pic:nvPicPr>
+                    <pic:cNvPr id="1861149701" name=""/>
+                    <pic:cNvPicPr/>
+                  </pic:nvPicPr>
+                  <pic:blipFill>
+                    <a:blip r:embed="rId45"/>
+                    <a:stretch>
+                      <a:fillRect/>
+                    </a:stretch>
+                  </pic:blipFill>
+                  <pic:spPr>
+                    <a:xfrm>
+                      <a:off x="0" y="0"/>
+                      <a:ext cx="5400040" cy="3037840"/>
+                    </a:xfrm>
+                    <a:prstGeom prst="rect">
+                      <a:avLst/>
+                    </a:prstGeom>
+                  </pic:spPr>
+                </pic:pic>
+              </a:graphicData>
+            </a:graphic>
+          </wp:inline>
+        </w:drawing>
+      </w:r>
+    </w:p>
+    <w:p>
+      <w:pPr>
+        <w:spacing w:after="0" w:line="240" w:lineRule="auto"/>
+        <w:rPr>
+          <w:lang w:val="pt-BR"/>
+        </w:rPr>
+      </w:pPr>
+    </w:p>
+    <w:p>
+      <w:pPr>
+        <w:spacing w:after="0" w:line="240" w:lineRule="auto"/>
+        <w:rPr>
+          <w:lang w:val="pt-BR"/>
+        </w:rPr>
+      </w:pPr>
+      <w:r>
+        <w:rPr>
+          <w:noProof/>
+        </w:rPr>
+        <w:drawing>
+          <wp:inline distT="0" distB="0" distL="0" distR="0" wp14:anchorId="5D7B56FE" wp14:editId="3A6FB49C">
+            <wp:extent cx="5400040" cy="3037840"/>
+            <wp:effectExtent l="0" t="0" r="0" b="0"/>
+            <wp:docPr id="1613755180" name="Picture 1"/>
+            <wp:cNvGraphicFramePr>
+              <a:graphicFrameLocks xmlns:a="http://schemas.openxmlformats.org/drawingml/2006/main" noChangeAspect="1"/>
+            </wp:cNvGraphicFramePr>
+            <a:graphic xmlns:a="http://schemas.openxmlformats.org/drawingml/2006/main">
+              <a:graphicData uri="http://schemas.openxmlformats.org/drawingml/2006/picture">
+                <pic:pic xmlns:pic="http://schemas.openxmlformats.org/drawingml/2006/picture">
+                  <pic:nvPicPr>
+                    <pic:cNvPr id="1613755180" name=""/>
+                    <pic:cNvPicPr/>
+                  </pic:nvPicPr>
+                  <pic:blipFill>
+                    <a:blip r:embed="rId46"/>
+                    <a:stretch>
+                      <a:fillRect/>
+                    </a:stretch>
+                  </pic:blipFill>
+                  <pic:spPr>
+                    <a:xfrm>
+                      <a:off x="0" y="0"/>
+                      <a:ext cx="5400040" cy="3037840"/>
+                    </a:xfrm>
+                    <a:prstGeom prst="rect">
+                      <a:avLst/>
+                    </a:prstGeom>
+                  </pic:spPr>
+                </pic:pic>
+              </a:graphicData>
+            </a:graphic>
+          </wp:inline>
+        </w:drawing>
+      </w:r>
+    </w:p>
+    <w:p>
+      <w:pPr>
+        <w:spacing w:after="0" w:line="240" w:lineRule="auto"/>
+        <w:rPr>
+          <w:lang w:val="pt-BR"/>
+        </w:rPr>
+      </w:pPr>
+    </w:p>
+    <w:p>
+      <w:pPr>
+        <w:spacing w:after="0" w:line="240" w:lineRule="auto"/>
+        <w:rPr>
+          <w:lang w:val="pt-BR"/>
+        </w:rPr>
+      </w:pPr>
+      <w:r>
+        <w:rPr>
+          <w:noProof/>
+        </w:rPr>
+        <w:lastRenderedPageBreak/>
+        <w:drawing>
+          <wp:inline distT="0" distB="0" distL="0" distR="0" wp14:anchorId="7AF0D0AD" wp14:editId="475D1CCE">
+            <wp:extent cx="5400040" cy="3037840"/>
+            <wp:effectExtent l="0" t="0" r="0" b="0"/>
+            <wp:docPr id="1273481495" name="Picture 1"/>
+            <wp:cNvGraphicFramePr>
+              <a:graphicFrameLocks xmlns:a="http://schemas.openxmlformats.org/drawingml/2006/main" noChangeAspect="1"/>
+            </wp:cNvGraphicFramePr>
+            <a:graphic xmlns:a="http://schemas.openxmlformats.org/drawingml/2006/main">
+              <a:graphicData uri="http://schemas.openxmlformats.org/drawingml/2006/picture">
+                <pic:pic xmlns:pic="http://schemas.openxmlformats.org/drawingml/2006/picture">
+                  <pic:nvPicPr>
+                    <pic:cNvPr id="1273481495" name=""/>
+                    <pic:cNvPicPr/>
+                  </pic:nvPicPr>
+                  <pic:blipFill>
+                    <a:blip r:embed="rId47"/>
+                    <a:stretch>
+                      <a:fillRect/>
+                    </a:stretch>
+                  </pic:blipFill>
+                  <pic:spPr>
+                    <a:xfrm>
+                      <a:off x="0" y="0"/>
+                      <a:ext cx="5400040" cy="3037840"/>
+                    </a:xfrm>
+                    <a:prstGeom prst="rect">
+                      <a:avLst/>
+                    </a:prstGeom>
+                  </pic:spPr>
+                </pic:pic>
+              </a:graphicData>
+            </a:graphic>
+          </wp:inline>
+        </w:drawing>
+      </w:r>
+    </w:p>
+    <w:p>
+      <w:pPr>
+        <w:spacing w:after="0" w:line="240" w:lineRule="auto"/>
+        <w:rPr>
+          <w:lang w:val="pt-BR"/>
+        </w:rPr>
+      </w:pPr>
+    </w:p>
+    <w:p>
+      <w:pPr>
+        <w:spacing w:after="0" w:line="240" w:lineRule="auto"/>
+        <w:rPr>
+          <w:lang w:val="pt-BR"/>
+        </w:rPr>
+      </w:pPr>
+      <w:r>
+        <w:rPr>
+          <w:noProof/>
+        </w:rPr>
+        <w:drawing>
+          <wp:inline distT="0" distB="0" distL="0" distR="0" wp14:anchorId="4E36218D" wp14:editId="39C109A3">
+            <wp:extent cx="5400040" cy="3037840"/>
+            <wp:effectExtent l="0" t="0" r="0" b="0"/>
+            <wp:docPr id="2023952520" name="Picture 1"/>
+            <wp:cNvGraphicFramePr>
+              <a:graphicFrameLocks xmlns:a="http://schemas.openxmlformats.org/drawingml/2006/main" noChangeAspect="1"/>
+            </wp:cNvGraphicFramePr>
+            <a:graphic xmlns:a="http://schemas.openxmlformats.org/drawingml/2006/main">
+              <a:graphicData uri="http://schemas.openxmlformats.org/drawingml/2006/picture">
+                <pic:pic xmlns:pic="http://schemas.openxmlformats.org/drawingml/2006/picture">
+                  <pic:nvPicPr>
+                    <pic:cNvPr id="2023952520" name=""/>
+                    <pic:cNvPicPr/>
+                  </pic:nvPicPr>
+                  <pic:blipFill>
+                    <a:blip r:embed="rId48"/>
+                    <a:stretch>
+                      <a:fillRect/>
+                    </a:stretch>
+                  </pic:blipFill>
+                  <pic:spPr>
+                    <a:xfrm>
+                      <a:off x="0" y="0"/>
+                      <a:ext cx="5400040" cy="3037840"/>
+                    </a:xfrm>
+                    <a:prstGeom prst="rect">
+                      <a:avLst/>
+                    </a:prstGeom>
+                  </pic:spPr>
+                </pic:pic>
+              </a:graphicData>
+            </a:graphic>
+          </wp:inline>
+        </w:drawing>
+      </w:r>
+    </w:p>
+    <w:p>
+      <w:pPr>
+        <w:spacing w:after="0" w:line="240" w:lineRule="auto"/>
+        <w:rPr>
+          <w:lang w:val="pt-BR"/>
+        </w:rPr>
+      </w:pPr>
+    </w:p>
+    <w:p>
+      <w:pPr>
+        <w:spacing w:after="0" w:line="240" w:lineRule="auto"/>
+        <w:rPr>
+          <w:lang w:val="pt-BR"/>
+        </w:rPr>
+      </w:pPr>
     </w:p>
     <w:p>
       <w:pPr>
@@ -628,6 +3156,304 @@
 <file path=word/numbering.xml><?xml version="1.0" encoding="utf-8"?>
 <w:numbering xmlns:wpc="http://schemas.microsoft.com/office/word/2010/wordprocessingCanvas" xmlns:cx="http://schemas.microsoft.com/office/drawing/2014/chartex" xmlns:cx1="http://schemas.microsoft.com/office/drawing/2015/9/8/chartex" xmlns:cx2="http://schemas.microsoft.com/office/drawing/2015/10/21/chartex" xmlns:cx3="http://schemas.microsoft.com/office/drawing/2016/5/9/chartex" xmlns:cx4="http://schemas.microsoft.com/office/drawing/2016/5/10/chartex" xmlns:cx5="http://schemas.microsoft.com/office/drawing/2016/5/11/chartex" xmlns:cx6="http://schemas.microsoft.com/office/drawing/2016/5/12/chartex" xmlns:cx7="http://schemas.microsoft.com/office/drawing/2016/5/13/chartex" xmlns:cx8="http://schemas.microsoft.com/office/drawing/2016/5/14/chartex" xmlns:mc="http://schemas.openxmlformats.org/markup-compatibility/2006" xmlns:aink="http://schemas.microsoft.com/office/drawing/2016/ink" xmlns:am3d="http://schemas.microsoft.com/office/drawing/2017/model3d" xmlns:o="urn:schemas-microsoft-com:office:office" xmlns:oel="http://schemas.microsoft.com/office/2019/extlst" xmlns:r="http://schemas.openxmlformats.org/officeDocument/2006/relationships" xmlns:m="http://schemas.openxmlformats.org/officeDocument/2006/math" xmlns:v="urn:schemas-microsoft-com:vml" xmlns:wp14="http://schemas.microsoft.com/office/word/2010/wordprocessingDrawing" xmlns:wp="http://schemas.openxmlformats.org/drawingml/2006/wordprocessingDrawing" xmlns:w10="urn:schemas-microsoft-com:office:word" xmlns:w="http://schemas.openxmlformats.org/wordprocessingml/2006/main" xmlns:w14="http://schemas.microsoft.com/office/word/2010/wordml" xmlns:w15="http://schemas.microsoft.com/office/word/2012/wordml" xmlns:w16cex="http://schemas.microsoft.com/office/word/2018/wordml/cex" xmlns:w16cid="http://schemas.microsoft.com/office/word/2016/wordml/cid" xmlns:w16="http://schemas.microsoft.com/office/word/2018/wordml" xmlns:w16du="http://schemas.microsoft.com/office/word/2023/wordml/word16du" xmlns:w16sdtdh="http://schemas.microsoft.com/office/word/2020/wordml/sdtdatahash" xmlns:w16sdtfl="http://schemas.microsoft.com/office/word/2024/wordml/sdtformatlock" xmlns:w16se="http://schemas.microsoft.com/office/word/2015/wordml/symex" xmlns:wpg="http://schemas.microsoft.com/office/word/2010/wordprocessingGroup" xmlns:wpi="http://schemas.microsoft.com/office/word/2010/wordprocessingInk" xmlns:wne="http://schemas.microsoft.com/office/word/2006/wordml" xmlns:wps="http://schemas.microsoft.com/office/word/2010/wordprocessingShape" mc:Ignorable="w14 w15 w16se w16cid w16 w16cex w16sdtdh w16sdtfl w16du wp14">
   <w:abstractNum w:abstractNumId="0" w15:restartNumberingAfterBreak="0">
+    <w:nsid w:val="047C26E9"/>
+    <w:multiLevelType w:val="multilevel"/>
+    <w:tmpl w:val="EB6EA02E"/>
+    <w:lvl w:ilvl="0">
+      <w:start w:val="1"/>
+      <w:numFmt w:val="bullet"/>
+      <w:lvlText w:val=""/>
+      <w:lvlJc w:val="left"/>
+      <w:pPr>
+        <w:tabs>
+          <w:tab w:val="num" w:pos="720"/>
+        </w:tabs>
+        <w:ind w:left="720" w:hanging="360"/>
+      </w:pPr>
+      <w:rPr>
+        <w:rFonts w:ascii="Symbol" w:hAnsi="Symbol" w:hint="default"/>
+        <w:sz w:val="20"/>
+      </w:rPr>
+    </w:lvl>
+    <w:lvl w:ilvl="1" w:tentative="1">
+      <w:start w:val="1"/>
+      <w:numFmt w:val="bullet"/>
+      <w:lvlText w:val="o"/>
+      <w:lvlJc w:val="left"/>
+      <w:pPr>
+        <w:tabs>
+          <w:tab w:val="num" w:pos="1440"/>
+        </w:tabs>
+        <w:ind w:left="1440" w:hanging="360"/>
+      </w:pPr>
+      <w:rPr>
+        <w:rFonts w:ascii="Courier New" w:hAnsi="Courier New" w:hint="default"/>
+        <w:sz w:val="20"/>
+      </w:rPr>
+    </w:lvl>
+    <w:lvl w:ilvl="2" w:tentative="1">
+      <w:start w:val="1"/>
+      <w:numFmt w:val="bullet"/>
+      <w:lvlText w:val=""/>
+      <w:lvlJc w:val="left"/>
+      <w:pPr>
+        <w:tabs>
+          <w:tab w:val="num" w:pos="2160"/>
+        </w:tabs>
+        <w:ind w:left="2160" w:hanging="360"/>
+      </w:pPr>
+      <w:rPr>
+        <w:rFonts w:ascii="Wingdings" w:hAnsi="Wingdings" w:hint="default"/>
+        <w:sz w:val="20"/>
+      </w:rPr>
+    </w:lvl>
+    <w:lvl w:ilvl="3" w:tentative="1">
+      <w:start w:val="1"/>
+      <w:numFmt w:val="bullet"/>
+      <w:lvlText w:val=""/>
+      <w:lvlJc w:val="left"/>
+      <w:pPr>
+        <w:tabs>
+          <w:tab w:val="num" w:pos="2880"/>
+        </w:tabs>
+        <w:ind w:left="2880" w:hanging="360"/>
+      </w:pPr>
+      <w:rPr>
+        <w:rFonts w:ascii="Wingdings" w:hAnsi="Wingdings" w:hint="default"/>
+        <w:sz w:val="20"/>
+      </w:rPr>
+    </w:lvl>
+    <w:lvl w:ilvl="4" w:tentative="1">
+      <w:start w:val="1"/>
+      <w:numFmt w:val="bullet"/>
+      <w:lvlText w:val=""/>
+      <w:lvlJc w:val="left"/>
+      <w:pPr>
+        <w:tabs>
+          <w:tab w:val="num" w:pos="3600"/>
+        </w:tabs>
+        <w:ind w:left="3600" w:hanging="360"/>
+      </w:pPr>
+      <w:rPr>
+        <w:rFonts w:ascii="Wingdings" w:hAnsi="Wingdings" w:hint="default"/>
+        <w:sz w:val="20"/>
+      </w:rPr>
+    </w:lvl>
+    <w:lvl w:ilvl="5" w:tentative="1">
+      <w:start w:val="1"/>
+      <w:numFmt w:val="bullet"/>
+      <w:lvlText w:val=""/>
+      <w:lvlJc w:val="left"/>
+      <w:pPr>
+        <w:tabs>
+          <w:tab w:val="num" w:pos="4320"/>
+        </w:tabs>
+        <w:ind w:left="4320" w:hanging="360"/>
+      </w:pPr>
+      <w:rPr>
+        <w:rFonts w:ascii="Wingdings" w:hAnsi="Wingdings" w:hint="default"/>
+        <w:sz w:val="20"/>
+      </w:rPr>
+    </w:lvl>
+    <w:lvl w:ilvl="6" w:tentative="1">
+      <w:start w:val="1"/>
+      <w:numFmt w:val="bullet"/>
+      <w:lvlText w:val=""/>
+      <w:lvlJc w:val="left"/>
+      <w:pPr>
+        <w:tabs>
+          <w:tab w:val="num" w:pos="5040"/>
+        </w:tabs>
+        <w:ind w:left="5040" w:hanging="360"/>
+      </w:pPr>
+      <w:rPr>
+        <w:rFonts w:ascii="Wingdings" w:hAnsi="Wingdings" w:hint="default"/>
+        <w:sz w:val="20"/>
+      </w:rPr>
+    </w:lvl>
+    <w:lvl w:ilvl="7" w:tentative="1">
+      <w:start w:val="1"/>
+      <w:numFmt w:val="bullet"/>
+      <w:lvlText w:val=""/>
+      <w:lvlJc w:val="left"/>
+      <w:pPr>
+        <w:tabs>
+          <w:tab w:val="num" w:pos="5760"/>
+        </w:tabs>
+        <w:ind w:left="5760" w:hanging="360"/>
+      </w:pPr>
+      <w:rPr>
+        <w:rFonts w:ascii="Wingdings" w:hAnsi="Wingdings" w:hint="default"/>
+        <w:sz w:val="20"/>
+      </w:rPr>
+    </w:lvl>
+    <w:lvl w:ilvl="8" w:tentative="1">
+      <w:start w:val="1"/>
+      <w:numFmt w:val="bullet"/>
+      <w:lvlText w:val=""/>
+      <w:lvlJc w:val="left"/>
+      <w:pPr>
+        <w:tabs>
+          <w:tab w:val="num" w:pos="6480"/>
+        </w:tabs>
+        <w:ind w:left="6480" w:hanging="360"/>
+      </w:pPr>
+      <w:rPr>
+        <w:rFonts w:ascii="Wingdings" w:hAnsi="Wingdings" w:hint="default"/>
+        <w:sz w:val="20"/>
+      </w:rPr>
+    </w:lvl>
+  </w:abstractNum>
+  <w:abstractNum w:abstractNumId="1" w15:restartNumberingAfterBreak="0">
+    <w:nsid w:val="07DF3213"/>
+    <w:multiLevelType w:val="multilevel"/>
+    <w:tmpl w:val="5D4C9A58"/>
+    <w:lvl w:ilvl="0">
+      <w:start w:val="1"/>
+      <w:numFmt w:val="bullet"/>
+      <w:lvlText w:val=""/>
+      <w:lvlJc w:val="left"/>
+      <w:pPr>
+        <w:tabs>
+          <w:tab w:val="num" w:pos="720"/>
+        </w:tabs>
+        <w:ind w:left="720" w:hanging="360"/>
+      </w:pPr>
+      <w:rPr>
+        <w:rFonts w:ascii="Symbol" w:hAnsi="Symbol" w:hint="default"/>
+        <w:sz w:val="20"/>
+      </w:rPr>
+    </w:lvl>
+    <w:lvl w:ilvl="1">
+      <w:start w:val="1"/>
+      <w:numFmt w:val="bullet"/>
+      <w:lvlText w:val="o"/>
+      <w:lvlJc w:val="left"/>
+      <w:pPr>
+        <w:tabs>
+          <w:tab w:val="num" w:pos="1440"/>
+        </w:tabs>
+        <w:ind w:left="1440" w:hanging="360"/>
+      </w:pPr>
+      <w:rPr>
+        <w:rFonts w:ascii="Courier New" w:hAnsi="Courier New" w:hint="default"/>
+        <w:sz w:val="20"/>
+      </w:rPr>
+    </w:lvl>
+    <w:lvl w:ilvl="2" w:tentative="1">
+      <w:start w:val="1"/>
+      <w:numFmt w:val="bullet"/>
+      <w:lvlText w:val=""/>
+      <w:lvlJc w:val="left"/>
+      <w:pPr>
+        <w:tabs>
+          <w:tab w:val="num" w:pos="2160"/>
+        </w:tabs>
+        <w:ind w:left="2160" w:hanging="360"/>
+      </w:pPr>
+      <w:rPr>
+        <w:rFonts w:ascii="Wingdings" w:hAnsi="Wingdings" w:hint="default"/>
+        <w:sz w:val="20"/>
+      </w:rPr>
+    </w:lvl>
+    <w:lvl w:ilvl="3" w:tentative="1">
+      <w:start w:val="1"/>
+      <w:numFmt w:val="bullet"/>
+      <w:lvlText w:val=""/>
+      <w:lvlJc w:val="left"/>
+      <w:pPr>
+        <w:tabs>
+          <w:tab w:val="num" w:pos="2880"/>
+        </w:tabs>
+        <w:ind w:left="2880" w:hanging="360"/>
+      </w:pPr>
+      <w:rPr>
+        <w:rFonts w:ascii="Wingdings" w:hAnsi="Wingdings" w:hint="default"/>
+        <w:sz w:val="20"/>
+      </w:rPr>
+    </w:lvl>
+    <w:lvl w:ilvl="4" w:tentative="1">
+      <w:start w:val="1"/>
+      <w:numFmt w:val="bullet"/>
+      <w:lvlText w:val=""/>
+      <w:lvlJc w:val="left"/>
+      <w:pPr>
+        <w:tabs>
+          <w:tab w:val="num" w:pos="3600"/>
+        </w:tabs>
+        <w:ind w:left="3600" w:hanging="360"/>
+      </w:pPr>
+      <w:rPr>
+        <w:rFonts w:ascii="Wingdings" w:hAnsi="Wingdings" w:hint="default"/>
+        <w:sz w:val="20"/>
+      </w:rPr>
+    </w:lvl>
+    <w:lvl w:ilvl="5" w:tentative="1">
+      <w:start w:val="1"/>
+      <w:numFmt w:val="bullet"/>
+      <w:lvlText w:val=""/>
+      <w:lvlJc w:val="left"/>
+      <w:pPr>
+        <w:tabs>
+          <w:tab w:val="num" w:pos="4320"/>
+        </w:tabs>
+        <w:ind w:left="4320" w:hanging="360"/>
+      </w:pPr>
+      <w:rPr>
+        <w:rFonts w:ascii="Wingdings" w:hAnsi="Wingdings" w:hint="default"/>
+        <w:sz w:val="20"/>
+      </w:rPr>
+    </w:lvl>
+    <w:lvl w:ilvl="6" w:tentative="1">
+      <w:start w:val="1"/>
+      <w:numFmt w:val="bullet"/>
+      <w:lvlText w:val=""/>
+      <w:lvlJc w:val="left"/>
+      <w:pPr>
+        <w:tabs>
+          <w:tab w:val="num" w:pos="5040"/>
+        </w:tabs>
+        <w:ind w:left="5040" w:hanging="360"/>
+      </w:pPr>
+      <w:rPr>
+        <w:rFonts w:ascii="Wingdings" w:hAnsi="Wingdings" w:hint="default"/>
+        <w:sz w:val="20"/>
+      </w:rPr>
+    </w:lvl>
+    <w:lvl w:ilvl="7" w:tentative="1">
+      <w:start w:val="1"/>
+      <w:numFmt w:val="bullet"/>
+      <w:lvlText w:val=""/>
+      <w:lvlJc w:val="left"/>
+      <w:pPr>
+        <w:tabs>
+          <w:tab w:val="num" w:pos="5760"/>
+        </w:tabs>
+        <w:ind w:left="5760" w:hanging="360"/>
+      </w:pPr>
+      <w:rPr>
+        <w:rFonts w:ascii="Wingdings" w:hAnsi="Wingdings" w:hint="default"/>
+        <w:sz w:val="20"/>
+      </w:rPr>
+    </w:lvl>
+    <w:lvl w:ilvl="8" w:tentative="1">
+      <w:start w:val="1"/>
+      <w:numFmt w:val="bullet"/>
+      <w:lvlText w:val=""/>
+      <w:lvlJc w:val="left"/>
+      <w:pPr>
+        <w:tabs>
+          <w:tab w:val="num" w:pos="6480"/>
+        </w:tabs>
+        <w:ind w:left="6480" w:hanging="360"/>
+      </w:pPr>
+      <w:rPr>
+        <w:rFonts w:ascii="Wingdings" w:hAnsi="Wingdings" w:hint="default"/>
+        <w:sz w:val="20"/>
+      </w:rPr>
+    </w:lvl>
+  </w:abstractNum>
+  <w:abstractNum w:abstractNumId="2" w15:restartNumberingAfterBreak="0">
     <w:nsid w:val="21894547"/>
     <w:multiLevelType w:val="multilevel"/>
     <w:tmpl w:val="FF40EE76"/>
@@ -776,7 +3602,7 @@
       </w:rPr>
     </w:lvl>
   </w:abstractNum>
-  <w:abstractNum w:abstractNumId="1" w15:restartNumberingAfterBreak="0">
+  <w:abstractNum w:abstractNumId="3" w15:restartNumberingAfterBreak="0">
     <w:nsid w:val="2C5C0AD7"/>
     <w:multiLevelType w:val="multilevel"/>
     <w:tmpl w:val="39B8CEFA"/>
@@ -925,7 +3751,156 @@
       </w:rPr>
     </w:lvl>
   </w:abstractNum>
-  <w:abstractNum w:abstractNumId="2" w15:restartNumberingAfterBreak="0">
+  <w:abstractNum w:abstractNumId="4" w15:restartNumberingAfterBreak="0">
+    <w:nsid w:val="3C444D0C"/>
+    <w:multiLevelType w:val="multilevel"/>
+    <w:tmpl w:val="2698F6FC"/>
+    <w:lvl w:ilvl="0">
+      <w:start w:val="1"/>
+      <w:numFmt w:val="bullet"/>
+      <w:lvlText w:val=""/>
+      <w:lvlJc w:val="left"/>
+      <w:pPr>
+        <w:tabs>
+          <w:tab w:val="num" w:pos="720"/>
+        </w:tabs>
+        <w:ind w:left="720" w:hanging="360"/>
+      </w:pPr>
+      <w:rPr>
+        <w:rFonts w:ascii="Symbol" w:hAnsi="Symbol" w:hint="default"/>
+        <w:sz w:val="20"/>
+      </w:rPr>
+    </w:lvl>
+    <w:lvl w:ilvl="1">
+      <w:start w:val="1"/>
+      <w:numFmt w:val="bullet"/>
+      <w:lvlText w:val="o"/>
+      <w:lvlJc w:val="left"/>
+      <w:pPr>
+        <w:tabs>
+          <w:tab w:val="num" w:pos="1440"/>
+        </w:tabs>
+        <w:ind w:left="1440" w:hanging="360"/>
+      </w:pPr>
+      <w:rPr>
+        <w:rFonts w:ascii="Courier New" w:hAnsi="Courier New" w:hint="default"/>
+        <w:sz w:val="20"/>
+      </w:rPr>
+    </w:lvl>
+    <w:lvl w:ilvl="2" w:tentative="1">
+      <w:start w:val="1"/>
+      <w:numFmt w:val="bullet"/>
+      <w:lvlText w:val=""/>
+      <w:lvlJc w:val="left"/>
+      <w:pPr>
+        <w:tabs>
+          <w:tab w:val="num" w:pos="2160"/>
+        </w:tabs>
+        <w:ind w:left="2160" w:hanging="360"/>
+      </w:pPr>
+      <w:rPr>
+        <w:rFonts w:ascii="Wingdings" w:hAnsi="Wingdings" w:hint="default"/>
+        <w:sz w:val="20"/>
+      </w:rPr>
+    </w:lvl>
+    <w:lvl w:ilvl="3" w:tentative="1">
+      <w:start w:val="1"/>
+      <w:numFmt w:val="bullet"/>
+      <w:lvlText w:val=""/>
+      <w:lvlJc w:val="left"/>
+      <w:pPr>
+        <w:tabs>
+          <w:tab w:val="num" w:pos="2880"/>
+        </w:tabs>
+        <w:ind w:left="2880" w:hanging="360"/>
+      </w:pPr>
+      <w:rPr>
+        <w:rFonts w:ascii="Wingdings" w:hAnsi="Wingdings" w:hint="default"/>
+        <w:sz w:val="20"/>
+      </w:rPr>
+    </w:lvl>
+    <w:lvl w:ilvl="4" w:tentative="1">
+      <w:start w:val="1"/>
+      <w:numFmt w:val="bullet"/>
+      <w:lvlText w:val=""/>
+      <w:lvlJc w:val="left"/>
+      <w:pPr>
+        <w:tabs>
+          <w:tab w:val="num" w:pos="3600"/>
+        </w:tabs>
+        <w:ind w:left="3600" w:hanging="360"/>
+      </w:pPr>
+      <w:rPr>
+        <w:rFonts w:ascii="Wingdings" w:hAnsi="Wingdings" w:hint="default"/>
+        <w:sz w:val="20"/>
+      </w:rPr>
+    </w:lvl>
+    <w:lvl w:ilvl="5" w:tentative="1">
+      <w:start w:val="1"/>
+      <w:numFmt w:val="bullet"/>
+      <w:lvlText w:val=""/>
+      <w:lvlJc w:val="left"/>
+      <w:pPr>
+        <w:tabs>
+          <w:tab w:val="num" w:pos="4320"/>
+        </w:tabs>
+        <w:ind w:left="4320" w:hanging="360"/>
+      </w:pPr>
+      <w:rPr>
+        <w:rFonts w:ascii="Wingdings" w:hAnsi="Wingdings" w:hint="default"/>
+        <w:sz w:val="20"/>
+      </w:rPr>
+    </w:lvl>
+    <w:lvl w:ilvl="6" w:tentative="1">
+      <w:start w:val="1"/>
+      <w:numFmt w:val="bullet"/>
+      <w:lvlText w:val=""/>
+      <w:lvlJc w:val="left"/>
+      <w:pPr>
+        <w:tabs>
+          <w:tab w:val="num" w:pos="5040"/>
+        </w:tabs>
+        <w:ind w:left="5040" w:hanging="360"/>
+      </w:pPr>
+      <w:rPr>
+        <w:rFonts w:ascii="Wingdings" w:hAnsi="Wingdings" w:hint="default"/>
+        <w:sz w:val="20"/>
+      </w:rPr>
+    </w:lvl>
+    <w:lvl w:ilvl="7" w:tentative="1">
+      <w:start w:val="1"/>
+      <w:numFmt w:val="bullet"/>
+      <w:lvlText w:val=""/>
+      <w:lvlJc w:val="left"/>
+      <w:pPr>
+        <w:tabs>
+          <w:tab w:val="num" w:pos="5760"/>
+        </w:tabs>
+        <w:ind w:left="5760" w:hanging="360"/>
+      </w:pPr>
+      <w:rPr>
+        <w:rFonts w:ascii="Wingdings" w:hAnsi="Wingdings" w:hint="default"/>
+        <w:sz w:val="20"/>
+      </w:rPr>
+    </w:lvl>
+    <w:lvl w:ilvl="8" w:tentative="1">
+      <w:start w:val="1"/>
+      <w:numFmt w:val="bullet"/>
+      <w:lvlText w:val=""/>
+      <w:lvlJc w:val="left"/>
+      <w:pPr>
+        <w:tabs>
+          <w:tab w:val="num" w:pos="6480"/>
+        </w:tabs>
+        <w:ind w:left="6480" w:hanging="360"/>
+      </w:pPr>
+      <w:rPr>
+        <w:rFonts w:ascii="Wingdings" w:hAnsi="Wingdings" w:hint="default"/>
+        <w:sz w:val="20"/>
+      </w:rPr>
+    </w:lvl>
+  </w:abstractNum>
+  <w:abstractNum w:abstractNumId="5" w15:restartNumberingAfterBreak="0">
     <w:nsid w:val="3E7B29D5"/>
     <w:multiLevelType w:val="multilevel"/>
     <w:tmpl w:val="2020D892"/>
@@ -1074,7 +4049,7 @@
       </w:rPr>
     </w:lvl>
   </w:abstractNum>
-  <w:abstractNum w:abstractNumId="3" w15:restartNumberingAfterBreak="0">
+  <w:abstractNum w:abstractNumId="6" w15:restartNumberingAfterBreak="0">
     <w:nsid w:val="3F2356C3"/>
     <w:multiLevelType w:val="multilevel"/>
     <w:tmpl w:val="77AED8D2"/>
@@ -1187,7 +4162,7 @@
       </w:pPr>
     </w:lvl>
   </w:abstractNum>
-  <w:abstractNum w:abstractNumId="4" w15:restartNumberingAfterBreak="0">
+  <w:abstractNum w:abstractNumId="7" w15:restartNumberingAfterBreak="0">
     <w:nsid w:val="49AB6D1B"/>
     <w:multiLevelType w:val="multilevel"/>
     <w:tmpl w:val="00F4E02C"/>
@@ -1300,7 +4275,305 @@
       </w:pPr>
     </w:lvl>
   </w:abstractNum>
-  <w:abstractNum w:abstractNumId="5" w15:restartNumberingAfterBreak="0">
+  <w:abstractNum w:abstractNumId="8" w15:restartNumberingAfterBreak="0">
+    <w:nsid w:val="4C8E2811"/>
+    <w:multiLevelType w:val="multilevel"/>
+    <w:tmpl w:val="BA1415A4"/>
+    <w:lvl w:ilvl="0">
+      <w:start w:val="1"/>
+      <w:numFmt w:val="bullet"/>
+      <w:lvlText w:val=""/>
+      <w:lvlJc w:val="left"/>
+      <w:pPr>
+        <w:tabs>
+          <w:tab w:val="num" w:pos="720"/>
+        </w:tabs>
+        <w:ind w:left="720" w:hanging="360"/>
+      </w:pPr>
+      <w:rPr>
+        <w:rFonts w:ascii="Symbol" w:hAnsi="Symbol" w:hint="default"/>
+        <w:sz w:val="20"/>
+      </w:rPr>
+    </w:lvl>
+    <w:lvl w:ilvl="1" w:tentative="1">
+      <w:start w:val="1"/>
+      <w:numFmt w:val="bullet"/>
+      <w:lvlText w:val="o"/>
+      <w:lvlJc w:val="left"/>
+      <w:pPr>
+        <w:tabs>
+          <w:tab w:val="num" w:pos="1440"/>
+        </w:tabs>
+        <w:ind w:left="1440" w:hanging="360"/>
+      </w:pPr>
+      <w:rPr>
+        <w:rFonts w:ascii="Courier New" w:hAnsi="Courier New" w:hint="default"/>
+        <w:sz w:val="20"/>
+      </w:rPr>
+    </w:lvl>
+    <w:lvl w:ilvl="2" w:tentative="1">
+      <w:start w:val="1"/>
+      <w:numFmt w:val="bullet"/>
+      <w:lvlText w:val=""/>
+      <w:lvlJc w:val="left"/>
+      <w:pPr>
+        <w:tabs>
+          <w:tab w:val="num" w:pos="2160"/>
+        </w:tabs>
+        <w:ind w:left="2160" w:hanging="360"/>
+      </w:pPr>
+      <w:rPr>
+        <w:rFonts w:ascii="Wingdings" w:hAnsi="Wingdings" w:hint="default"/>
+        <w:sz w:val="20"/>
+      </w:rPr>
+    </w:lvl>
+    <w:lvl w:ilvl="3" w:tentative="1">
+      <w:start w:val="1"/>
+      <w:numFmt w:val="bullet"/>
+      <w:lvlText w:val=""/>
+      <w:lvlJc w:val="left"/>
+      <w:pPr>
+        <w:tabs>
+          <w:tab w:val="num" w:pos="2880"/>
+        </w:tabs>
+        <w:ind w:left="2880" w:hanging="360"/>
+      </w:pPr>
+      <w:rPr>
+        <w:rFonts w:ascii="Wingdings" w:hAnsi="Wingdings" w:hint="default"/>
+        <w:sz w:val="20"/>
+      </w:rPr>
+    </w:lvl>
+    <w:lvl w:ilvl="4" w:tentative="1">
+      <w:start w:val="1"/>
+      <w:numFmt w:val="bullet"/>
+      <w:lvlText w:val=""/>
+      <w:lvlJc w:val="left"/>
+      <w:pPr>
+        <w:tabs>
+          <w:tab w:val="num" w:pos="3600"/>
+        </w:tabs>
+        <w:ind w:left="3600" w:hanging="360"/>
+      </w:pPr>
+      <w:rPr>
+        <w:rFonts w:ascii="Wingdings" w:hAnsi="Wingdings" w:hint="default"/>
+        <w:sz w:val="20"/>
+      </w:rPr>
+    </w:lvl>
+    <w:lvl w:ilvl="5" w:tentative="1">
+      <w:start w:val="1"/>
+      <w:numFmt w:val="bullet"/>
+      <w:lvlText w:val=""/>
+      <w:lvlJc w:val="left"/>
+      <w:pPr>
+        <w:tabs>
+          <w:tab w:val="num" w:pos="4320"/>
+        </w:tabs>
+        <w:ind w:left="4320" w:hanging="360"/>
+      </w:pPr>
+      <w:rPr>
+        <w:rFonts w:ascii="Wingdings" w:hAnsi="Wingdings" w:hint="default"/>
+        <w:sz w:val="20"/>
+      </w:rPr>
+    </w:lvl>
+    <w:lvl w:ilvl="6" w:tentative="1">
+      <w:start w:val="1"/>
+      <w:numFmt w:val="bullet"/>
+      <w:lvlText w:val=""/>
+      <w:lvlJc w:val="left"/>
+      <w:pPr>
+        <w:tabs>
+          <w:tab w:val="num" w:pos="5040"/>
+        </w:tabs>
+        <w:ind w:left="5040" w:hanging="360"/>
+      </w:pPr>
+      <w:rPr>
+        <w:rFonts w:ascii="Wingdings" w:hAnsi="Wingdings" w:hint="default"/>
+        <w:sz w:val="20"/>
+      </w:rPr>
+    </w:lvl>
+    <w:lvl w:ilvl="7" w:tentative="1">
+      <w:start w:val="1"/>
+      <w:numFmt w:val="bullet"/>
+      <w:lvlText w:val=""/>
+      <w:lvlJc w:val="left"/>
+      <w:pPr>
+        <w:tabs>
+          <w:tab w:val="num" w:pos="5760"/>
+        </w:tabs>
+        <w:ind w:left="5760" w:hanging="360"/>
+      </w:pPr>
+      <w:rPr>
+        <w:rFonts w:ascii="Wingdings" w:hAnsi="Wingdings" w:hint="default"/>
+        <w:sz w:val="20"/>
+      </w:rPr>
+    </w:lvl>
+    <w:lvl w:ilvl="8" w:tentative="1">
+      <w:start w:val="1"/>
+      <w:numFmt w:val="bullet"/>
+      <w:lvlText w:val=""/>
+      <w:lvlJc w:val="left"/>
+      <w:pPr>
+        <w:tabs>
+          <w:tab w:val="num" w:pos="6480"/>
+        </w:tabs>
+        <w:ind w:left="6480" w:hanging="360"/>
+      </w:pPr>
+      <w:rPr>
+        <w:rFonts w:ascii="Wingdings" w:hAnsi="Wingdings" w:hint="default"/>
+        <w:sz w:val="20"/>
+      </w:rPr>
+    </w:lvl>
+  </w:abstractNum>
+  <w:abstractNum w:abstractNumId="9" w15:restartNumberingAfterBreak="0">
+    <w:nsid w:val="58126660"/>
+    <w:multiLevelType w:val="multilevel"/>
+    <w:tmpl w:val="9DD8E60E"/>
+    <w:lvl w:ilvl="0">
+      <w:start w:val="1"/>
+      <w:numFmt w:val="bullet"/>
+      <w:lvlText w:val=""/>
+      <w:lvlJc w:val="left"/>
+      <w:pPr>
+        <w:tabs>
+          <w:tab w:val="num" w:pos="1800"/>
+        </w:tabs>
+        <w:ind w:left="1800" w:hanging="360"/>
+      </w:pPr>
+      <w:rPr>
+        <w:rFonts w:ascii="Symbol" w:hAnsi="Symbol" w:hint="default"/>
+        <w:sz w:val="20"/>
+      </w:rPr>
+    </w:lvl>
+    <w:lvl w:ilvl="1" w:tentative="1">
+      <w:start w:val="1"/>
+      <w:numFmt w:val="bullet"/>
+      <w:lvlText w:val="o"/>
+      <w:lvlJc w:val="left"/>
+      <w:pPr>
+        <w:tabs>
+          <w:tab w:val="num" w:pos="2520"/>
+        </w:tabs>
+        <w:ind w:left="2520" w:hanging="360"/>
+      </w:pPr>
+      <w:rPr>
+        <w:rFonts w:ascii="Courier New" w:hAnsi="Courier New" w:hint="default"/>
+        <w:sz w:val="20"/>
+      </w:rPr>
+    </w:lvl>
+    <w:lvl w:ilvl="2" w:tentative="1">
+      <w:start w:val="1"/>
+      <w:numFmt w:val="bullet"/>
+      <w:lvlText w:val=""/>
+      <w:lvlJc w:val="left"/>
+      <w:pPr>
+        <w:tabs>
+          <w:tab w:val="num" w:pos="3240"/>
+        </w:tabs>
+        <w:ind w:left="3240" w:hanging="360"/>
+      </w:pPr>
+      <w:rPr>
+        <w:rFonts w:ascii="Wingdings" w:hAnsi="Wingdings" w:hint="default"/>
+        <w:sz w:val="20"/>
+      </w:rPr>
+    </w:lvl>
+    <w:lvl w:ilvl="3" w:tentative="1">
+      <w:start w:val="1"/>
+      <w:numFmt w:val="bullet"/>
+      <w:lvlText w:val=""/>
+      <w:lvlJc w:val="left"/>
+      <w:pPr>
+        <w:tabs>
+          <w:tab w:val="num" w:pos="3960"/>
+        </w:tabs>
+        <w:ind w:left="3960" w:hanging="360"/>
+      </w:pPr>
+      <w:rPr>
+        <w:rFonts w:ascii="Wingdings" w:hAnsi="Wingdings" w:hint="default"/>
+        <w:sz w:val="20"/>
+      </w:rPr>
+    </w:lvl>
+    <w:lvl w:ilvl="4" w:tentative="1">
+      <w:start w:val="1"/>
+      <w:numFmt w:val="bullet"/>
+      <w:lvlText w:val=""/>
+      <w:lvlJc w:val="left"/>
+      <w:pPr>
+        <w:tabs>
+          <w:tab w:val="num" w:pos="4680"/>
+        </w:tabs>
+        <w:ind w:left="4680" w:hanging="360"/>
+      </w:pPr>
+      <w:rPr>
+        <w:rFonts w:ascii="Wingdings" w:hAnsi="Wingdings" w:hint="default"/>
+        <w:sz w:val="20"/>
+      </w:rPr>
+    </w:lvl>
+    <w:lvl w:ilvl="5" w:tentative="1">
+      <w:start w:val="1"/>
+      <w:numFmt w:val="bullet"/>
+      <w:lvlText w:val=""/>
+      <w:lvlJc w:val="left"/>
+      <w:pPr>
+        <w:tabs>
+          <w:tab w:val="num" w:pos="5400"/>
+        </w:tabs>
+        <w:ind w:left="5400" w:hanging="360"/>
+      </w:pPr>
+      <w:rPr>
+        <w:rFonts w:ascii="Wingdings" w:hAnsi="Wingdings" w:hint="default"/>
+        <w:sz w:val="20"/>
+      </w:rPr>
+    </w:lvl>
+    <w:lvl w:ilvl="6" w:tentative="1">
+      <w:start w:val="1"/>
+      <w:numFmt w:val="bullet"/>
+      <w:lvlText w:val=""/>
+      <w:lvlJc w:val="left"/>
+      <w:pPr>
+        <w:tabs>
+          <w:tab w:val="num" w:pos="6120"/>
+        </w:tabs>
+        <w:ind w:left="6120" w:hanging="360"/>
+      </w:pPr>
+      <w:rPr>
+        <w:rFonts w:ascii="Wingdings" w:hAnsi="Wingdings" w:hint="default"/>
+        <w:sz w:val="20"/>
+      </w:rPr>
+    </w:lvl>
+    <w:lvl w:ilvl="7" w:tentative="1">
+      <w:start w:val="1"/>
+      <w:numFmt w:val="bullet"/>
+      <w:lvlText w:val=""/>
+      <w:lvlJc w:val="left"/>
+      <w:pPr>
+        <w:tabs>
+          <w:tab w:val="num" w:pos="6840"/>
+        </w:tabs>
+        <w:ind w:left="6840" w:hanging="360"/>
+      </w:pPr>
+      <w:rPr>
+        <w:rFonts w:ascii="Wingdings" w:hAnsi="Wingdings" w:hint="default"/>
+        <w:sz w:val="20"/>
+      </w:rPr>
+    </w:lvl>
+    <w:lvl w:ilvl="8" w:tentative="1">
+      <w:start w:val="1"/>
+      <w:numFmt w:val="bullet"/>
+      <w:lvlText w:val=""/>
+      <w:lvlJc w:val="left"/>
+      <w:pPr>
+        <w:tabs>
+          <w:tab w:val="num" w:pos="7560"/>
+        </w:tabs>
+        <w:ind w:left="7560" w:hanging="360"/>
+      </w:pPr>
+      <w:rPr>
+        <w:rFonts w:ascii="Wingdings" w:hAnsi="Wingdings" w:hint="default"/>
+        <w:sz w:val="20"/>
+      </w:rPr>
+    </w:lvl>
+  </w:abstractNum>
+  <w:abstractNum w:abstractNumId="10" w15:restartNumberingAfterBreak="0">
     <w:nsid w:val="5A007657"/>
     <w:multiLevelType w:val="multilevel"/>
     <w:tmpl w:val="5B180710"/>
@@ -1449,7 +4722,7 @@
       </w:rPr>
     </w:lvl>
   </w:abstractNum>
-  <w:abstractNum w:abstractNumId="6" w15:restartNumberingAfterBreak="0">
+  <w:abstractNum w:abstractNumId="11" w15:restartNumberingAfterBreak="0">
     <w:nsid w:val="747874DF"/>
     <w:multiLevelType w:val="multilevel"/>
     <w:tmpl w:val="A1EE9B14"/>
@@ -1598,7 +4871,7 @@
       </w:rPr>
     </w:lvl>
   </w:abstractNum>
-  <w:abstractNum w:abstractNumId="7" w15:restartNumberingAfterBreak="0">
+  <w:abstractNum w:abstractNumId="12" w15:restartNumberingAfterBreak="0">
     <w:nsid w:val="75871E9B"/>
     <w:multiLevelType w:val="multilevel"/>
     <w:tmpl w:val="8FF41992"/>
@@ -1748,28 +5021,43 @@
     </w:lvl>
   </w:abstractNum>
   <w:num w:numId="1" w16cid:durableId="1917785581">
+    <w:abstractNumId w:val="3"/>
+  </w:num>
+  <w:num w:numId="2" w16cid:durableId="974331090">
+    <w:abstractNumId w:val="10"/>
+  </w:num>
+  <w:num w:numId="3" w16cid:durableId="1030883889">
+    <w:abstractNumId w:val="7"/>
+  </w:num>
+  <w:num w:numId="4" w16cid:durableId="1906136743">
+    <w:abstractNumId w:val="2"/>
+  </w:num>
+  <w:num w:numId="5" w16cid:durableId="2001888996">
+    <w:abstractNumId w:val="5"/>
+  </w:num>
+  <w:num w:numId="6" w16cid:durableId="2102602852">
+    <w:abstractNumId w:val="11"/>
+  </w:num>
+  <w:num w:numId="7" w16cid:durableId="1125196878">
+    <w:abstractNumId w:val="6"/>
+  </w:num>
+  <w:num w:numId="8" w16cid:durableId="1008827936">
+    <w:abstractNumId w:val="12"/>
+  </w:num>
+  <w:num w:numId="9" w16cid:durableId="1460494672">
+    <w:abstractNumId w:val="8"/>
+  </w:num>
+  <w:num w:numId="10" w16cid:durableId="1596135000">
     <w:abstractNumId w:val="1"/>
   </w:num>
-  <w:num w:numId="2" w16cid:durableId="974331090">
-    <w:abstractNumId w:val="5"/>
+  <w:num w:numId="11" w16cid:durableId="471564079">
+    <w:abstractNumId w:val="9"/>
   </w:num>
-  <w:num w:numId="3" w16cid:durableId="1030883889">
-    <w:abstractNumId w:val="4"/>
-  </w:num>
-  <w:num w:numId="4" w16cid:durableId="1906136743">
+  <w:num w:numId="12" w16cid:durableId="1024327897">
     <w:abstractNumId w:val="0"/>
   </w:num>
-  <w:num w:numId="5" w16cid:durableId="2001888996">
-    <w:abstractNumId w:val="2"/>
-  </w:num>
-  <w:num w:numId="6" w16cid:durableId="2102602852">
-    <w:abstractNumId w:val="6"/>
-  </w:num>
-  <w:num w:numId="7" w16cid:durableId="1125196878">
-    <w:abstractNumId w:val="3"/>
-  </w:num>
-  <w:num w:numId="8" w16cid:durableId="1008827936">
-    <w:abstractNumId w:val="7"/>
+  <w:num w:numId="13" w16cid:durableId="1838576693">
+    <w:abstractNumId w:val="4"/>
   </w:num>
 </w:numbering>
 </file>
@@ -2689,6 +5977,41 @@
       <w:spacing w:val="5"/>
     </w:rPr>
   </w:style>
+  <w:style w:type="character" w:styleId="Hyperlink">
+    <w:name w:val="Hyperlink"/>
+    <w:basedOn w:val="DefaultParagraphFont"/>
+    <w:uiPriority w:val="99"/>
+    <w:unhideWhenUsed/>
+    <w:rsid w:val="00C11244"/>
+    <w:rPr>
+      <w:color w:val="467886" w:themeColor="hyperlink"/>
+      <w:u w:val="single"/>
+    </w:rPr>
+  </w:style>
+  <w:style w:type="character" w:styleId="UnresolvedMention">
+    <w:name w:val="Unresolved Mention"/>
+    <w:basedOn w:val="DefaultParagraphFont"/>
+    <w:uiPriority w:val="99"/>
+    <w:semiHidden/>
+    <w:unhideWhenUsed/>
+    <w:rsid w:val="00C11244"/>
+    <w:rPr>
+      <w:color w:val="605E5C"/>
+      <w:shd w:val="clear" w:color="auto" w:fill="E1DFDD"/>
+    </w:rPr>
+  </w:style>
+  <w:style w:type="character" w:styleId="FollowedHyperlink">
+    <w:name w:val="FollowedHyperlink"/>
+    <w:basedOn w:val="DefaultParagraphFont"/>
+    <w:uiPriority w:val="99"/>
+    <w:semiHidden/>
+    <w:unhideWhenUsed/>
+    <w:rsid w:val="00C11244"/>
+    <w:rPr>
+      <w:color w:val="96607D" w:themeColor="followedHyperlink"/>
+      <w:u w:val="single"/>
+    </w:rPr>
+  </w:style>
 </w:styles>
 </file>
 

</xml_diff>